<commit_message>
add summer in  the city
</commit_message>
<xml_diff>
--- a/docs/03-KlimaCheck-Schulhof/sitzung-3-02-Dokumentation.docx
+++ b/docs/03-KlimaCheck-Schulhof/sitzung-3-02-Dokumentation.docx
@@ -58,7 +58,7 @@
         <w:t xml:space="preserve"> </w:t>
       </w:r>
       <w:r>
-        <w:t xml:space="preserve">ist ein vereinfachtes, didaktisches Mikroklima-Modell für Schulhof-Workshops. Das Modell bildet keinen realen Schulhof prognostisch exakt ab. Es dient als</w:t>
+        <w:t xml:space="preserve">ist ein vereinfachtes, didaktisches Mikroklima-Modell für Schulhof-Workshops. Es bildet keinen realen Schulhof prognostisch exakt ab, sondern dient als</w:t>
       </w:r>
       <w:r>
         <w:t xml:space="preserve"> </w:t>
@@ -68,10 +68,10 @@
           <w:b/>
           <w:bCs/>
         </w:rPr>
-        <w:t xml:space="preserve">physikalisch plausibles Vergleichsmodell</w:t>
-      </w:r>
-      <w:r>
-        <w:t xml:space="preserve">, mit dem Schülerinnen und Schüler untersuchen können, wie Materialien, Gebäude, Schatten, Vegetation, Dachbegrünung und Fassadenbegrünung die thermische Belastung auf Aufenthaltsflächen verändern.</w:t>
+        <w:t xml:space="preserve">physikalisch begründetes Vergleichsmodell</w:t>
+      </w:r>
+      <w:r>
+        <w:t xml:space="preserve">. Schülerinnen und Schüler können damit untersuchen, wie Materialien, Gebäude, Schatten, Vegetation, Dachbegrünung und Fassadenbegrünung die thermische Belastung auf Aufenthaltsflächen verändern.</w:t>
       </w:r>
     </w:p>
     <w:p>
@@ -79,7 +79,57 @@
         <w:pStyle w:val="BodyText"/>
       </w:pPr>
       <w:r>
-        <w:t xml:space="preserve">Der zentrale Einsatzfall ist nicht die Vorhersage absoluter Temperaturen, sondern der Vergleich von Varianten:</w:t>
+        <w:t xml:space="preserve">Die Modellphysik ist</w:t>
+      </w:r>
+      <w:r>
+        <w:t xml:space="preserve"> </w:t>
+      </w:r>
+      <w:r>
+        <w:rPr>
+          <w:b/>
+          <w:bCs/>
+        </w:rPr>
+        <w:t xml:space="preserve">semi-mechanistisch</w:t>
+      </w:r>
+      <w:r>
+        <w:t xml:space="preserve">. Oberflächentemperaturen werden aus einer vereinfachten Energiebilanz berechnet und an ein parametrisiertes bodennahes Luftfeld gekoppelt. Material-, Schatten-, Wasser-, Vegetations- und Fassadeneffekte wirken dabei über getrennte Prozesspfade. Der Variantenvergleich ist deshalb physikalisch begründet, solange er relativ und modellintern interpretiert wird. Die absolute Temperaturhöhe und die exakte Stärke einzelner Maßnahmen sind dagegen nicht validiert und daher nicht als standortspezifische Prognose zu verwenden.</w:t>
+      </w:r>
+    </w:p>
+    <w:p>
+      <w:pPr>
+        <w:pStyle w:val="BodyText"/>
+      </w:pPr>
+      <w:r>
+        <w:t xml:space="preserve">Das Modell verwendet</w:t>
+      </w:r>
+      <w:r>
+        <w:t xml:space="preserve"> </w:t>
+      </w:r>
+      <w:r>
+        <w:rPr>
+          <w:b/>
+          <w:bCs/>
+        </w:rPr>
+        <w:t xml:space="preserve">effektive Prozessparameter</w:t>
+      </w:r>
+      <w:r>
+        <w:t xml:space="preserve">. Diese Parameter sind keine willkürlichen didaktischen Stellgrößen, sondern notwendige Näherungen für physikalische Prozesse, die in einem vereinfachten zweidimensionalen Modell nicht vollständig aufgelöst werden können. Insbesondere löst das Modell keine vollständige Massen- und Impulserhaltung des bodennahen Luftvolumens. Deshalb werden Wärmeübergang, vertikale und laterale Luftmischung, Verdunstung, Substratkopplung und Fassadenwirkung über effektive Koeffizienten beschrieben. Diese Parametrisierung ersetzt keine Physik, sondern schließt die vereinfachte Modellstruktur so, dass bekannte Wirkungsrichtungen und relative Unterschiede zwischen Materialien und Maßnahmen plausibel abgebildet werden.</w:t>
+      </w:r>
+    </w:p>
+    <w:p>
+      <w:pPr>
+        <w:pStyle w:val="BlockText"/>
+      </w:pPr>
+      <w:r>
+        <w:t xml:space="preserve">Die Physik ist hart genug für relative Wirkungsvergleiche, aber nicht hart genug für quantitative Planungsaussagen.</w:t>
+      </w:r>
+    </w:p>
+    <w:p>
+      <w:pPr>
+        <w:pStyle w:val="FirstParagraph"/>
+      </w:pPr>
+      <w:r>
+        <w:t xml:space="preserve">Der zentrale Einsatzfall ist daher nicht die Vorhersage absoluter Temperaturen, sondern der kontrollierte Vergleich von Varianten:</w:t>
       </w:r>
     </w:p>
     <w:p>
@@ -154,25 +204,2593 @@
         <w:t xml:space="preserve">flächige Maßnahmen gegen punktuelle Maßnahmen</w:t>
       </w:r>
     </w:p>
+    <w:bookmarkEnd w:id="20"/>
+    <w:bookmarkStart w:id="27" w:name="leseschlüssel-für-lehrkräfte"/>
+    <w:p>
+      <w:pPr>
+        <w:pStyle w:val="Heading1"/>
+      </w:pPr>
+      <w:r>
+        <w:t xml:space="preserve">Leseschlüssel für Lehrkräfte</w:t>
+      </w:r>
+    </w:p>
     <w:p>
       <w:pPr>
         <w:pStyle w:val="FirstParagraph"/>
       </w:pPr>
       <w:r>
-        <w:t xml:space="preserve">Das Modell arbeitet deshalb bewusst mit effektiven, didaktischen Parametern. Viele Größen sind nicht als direkt kalibrierte Messwerte zu lesen, sondern als modellinterne Wirkparameter, die typische physikalische Unterschiede sichtbar machen.</w:t>
-      </w:r>
-    </w:p>
-    <w:bookmarkEnd w:id="20"/>
-    <w:bookmarkStart w:id="24" w:name="grundstruktur"/>
+        <w:t xml:space="preserve">Diese Dokumentation beschreibt ein vereinfachtes Mikroklima-Modell. Viele Begriffe stammen aus der Physik oder aus der Mikrometeorologie, werden im Modell aber bewusst vereinfacht verwendet. Der folgende Abschnitt erklärt die wichtigsten Begriffe, damit die späteren Formeln und Tabellen lesbar werden.</w:t>
+      </w:r>
+    </w:p>
+    <w:bookmarkStart w:id="21" w:name="was-bedeutet-physikalisch-plausibel"/>
+    <w:p>
+      <w:pPr>
+        <w:pStyle w:val="Heading2"/>
+      </w:pPr>
+      <w:r>
+        <w:t xml:space="preserve">Was bedeutet „physikalisch plausibel“?</w:t>
+      </w:r>
+    </w:p>
+    <w:p>
+      <w:pPr>
+        <w:pStyle w:val="FirstParagraph"/>
+      </w:pPr>
+      <w:r>
+        <w:t xml:space="preserve">Physikalisch plausibel bedeutet in diesem Modell nicht, dass jede reale Luftbewegung, jeder Bodenprozess und jede Pflanze exakt berechnet wird. Es bedeutet: Die wichtigsten Wirkungsrichtungen sind physikalisch begründet und voneinander getrennt modelliert.</w:t>
+      </w:r>
+    </w:p>
+    <w:p>
+      <w:pPr>
+        <w:pStyle w:val="BodyText"/>
+      </w:pPr>
+      <w:r>
+        <w:t xml:space="preserve">Ein Beispiel:</w:t>
+      </w:r>
+    </w:p>
+    <w:p>
+      <w:pPr>
+        <w:pStyle w:val="Compact"/>
+        <w:numPr>
+          <w:ilvl w:val="0"/>
+          <w:numId w:val="1002"/>
+        </w:numPr>
+      </w:pPr>
+      <w:r>
+        <w:t xml:space="preserve">Asphalt wird nicht einfach rot eingefärbt, weil Asphalt „heiß sein soll“.</w:t>
+      </w:r>
+    </w:p>
+    <w:p>
+      <w:pPr>
+        <w:pStyle w:val="Compact"/>
+        <w:numPr>
+          <w:ilvl w:val="0"/>
+          <w:numId w:val="1002"/>
+        </w:numPr>
+      </w:pPr>
+      <w:r>
+        <w:t xml:space="preserve">Asphalt wird heiß, weil er dunkel ist, kaum reflektiert, nicht verdunstet und wenig Kühlung durch Wasser liefert.</w:t>
+      </w:r>
+    </w:p>
+    <w:p>
+      <w:pPr>
+        <w:pStyle w:val="Compact"/>
+        <w:numPr>
+          <w:ilvl w:val="0"/>
+          <w:numId w:val="1002"/>
+        </w:numPr>
+      </w:pPr>
+      <w:r>
+        <w:t xml:space="preserve">Rasen bleibt kühler, weil er Wasser speichern und über Verdunstung Energie abführen kann.</w:t>
+      </w:r>
+    </w:p>
+    <w:p>
+      <w:pPr>
+        <w:pStyle w:val="Compact"/>
+        <w:numPr>
+          <w:ilvl w:val="0"/>
+          <w:numId w:val="1002"/>
+        </w:numPr>
+      </w:pPr>
+      <w:r>
+        <w:t xml:space="preserve">Bäume wirken zusätzlich über Schatten, nicht nur über eine grüne Oberfläche.</w:t>
+      </w:r>
+    </w:p>
+    <w:p>
+      <w:pPr>
+        <w:pStyle w:val="FirstParagraph"/>
+      </w:pPr>
+      <w:r>
+        <w:t xml:space="preserve">Das Modell bildet also keine beliebigen Farben ab, sondern eine vereinfachte Wirklogik: Strahlung, Material, Wasser, Schatten, Luftaustausch und Vegetation greifen zusammen.</w:t>
+      </w:r>
+    </w:p>
+    <w:bookmarkEnd w:id="21"/>
+    <w:bookmarkStart w:id="22" w:name="was-wird-im-modell-eigentlich-verglichen"/>
+    <w:p>
+      <w:pPr>
+        <w:pStyle w:val="Heading2"/>
+      </w:pPr>
+      <w:r>
+        <w:t xml:space="preserve">Was wird im Modell eigentlich verglichen?</w:t>
+      </w:r>
+    </w:p>
+    <w:p>
+      <w:pPr>
+        <w:pStyle w:val="FirstParagraph"/>
+      </w:pPr>
+      <w:r>
+        <w:t xml:space="preserve">Das Modell vergleicht immer Varianten unter denselben Randbedingungen. Das heißt: Tagesgang, Jahreszeit, Wind, Sonne und Modelllogik bleiben gleich. Verändert wird nur der Schulhofzustand, zum Beispiel Asphalt gegen Rasen oder normales Dach gegen Gründach.</w:t>
+      </w:r>
+    </w:p>
+    <w:p>
+      <w:pPr>
+        <w:pStyle w:val="BodyText"/>
+      </w:pPr>
+      <w:r>
+        <w:t xml:space="preserve">Dadurch sind Aussagen dieser Art begründet:</w:t>
+      </w:r>
+    </w:p>
+    <w:p>
+      <w:pPr>
+        <w:pStyle w:val="BlockText"/>
+      </w:pPr>
+      <w:r>
+        <w:t xml:space="preserve">Im Modell senkt diese Maßnahme die Hitzelast stärker als jene Maßnahme.</w:t>
+      </w:r>
+    </w:p>
+    <w:p>
+      <w:pPr>
+        <w:pStyle w:val="FirstParagraph"/>
+      </w:pPr>
+      <w:r>
+        <w:t xml:space="preserve">Nicht begründet sind Aussagen dieser Art:</w:t>
+      </w:r>
+    </w:p>
+    <w:p>
+      <w:pPr>
+        <w:pStyle w:val="BlockText"/>
+      </w:pPr>
+      <w:r>
+        <w:t xml:space="preserve">Diese Maßnahme senkt auf einem realen Schulhof die Lufttemperatur exakt um 2.3 °C.</w:t>
+      </w:r>
+    </w:p>
+    <w:p>
+      <w:pPr>
+        <w:pStyle w:val="FirstParagraph"/>
+      </w:pPr>
+      <w:r>
+        <w:t xml:space="preserve">Der Vergleich ist also</w:t>
+      </w:r>
+      <w:r>
+        <w:t xml:space="preserve"> </w:t>
+      </w:r>
+      <w:r>
+        <w:rPr>
+          <w:b/>
+          <w:bCs/>
+        </w:rPr>
+        <w:t xml:space="preserve">relativ stark</w:t>
+      </w:r>
+      <w:r>
+        <w:t xml:space="preserve">, aber</w:t>
+      </w:r>
+      <w:r>
+        <w:t xml:space="preserve"> </w:t>
+      </w:r>
+      <w:r>
+        <w:rPr>
+          <w:b/>
+          <w:bCs/>
+        </w:rPr>
+        <w:t xml:space="preserve">absolut nicht kalibriert</w:t>
+      </w:r>
+      <w:r>
+        <w:t xml:space="preserve">.</w:t>
+      </w:r>
+    </w:p>
+    <w:bookmarkEnd w:id="22"/>
+    <w:bookmarkStart w:id="23" w:name="die-drei-temperaturbegriffe-im-modell"/>
+    <w:p>
+      <w:pPr>
+        <w:pStyle w:val="Heading2"/>
+      </w:pPr>
+      <w:r>
+        <w:t xml:space="preserve">Die drei Temperaturbegriffe im Modell</w:t>
+      </w:r>
+    </w:p>
+    <w:p>
+      <w:pPr>
+        <w:pStyle w:val="FirstParagraph"/>
+      </w:pPr>
+      <w:r>
+        <w:t xml:space="preserve">Im Modell gibt es nicht nur „die Temperatur“. Es werden mehrere Temperaturarten unterschieden.</w:t>
+      </w:r>
+    </w:p>
+    <w:tbl>
+      <w:tblPr>
+        <w:tblStyle w:val="Table"/>
+        <w:tblW w:type="pct" w:w="5000"/>
+        <w:tblLayout w:type="fixed"/>
+        <w:tblLook w:firstRow="1" w:lastRow="0" w:firstColumn="0" w:lastColumn="0" w:noHBand="0" w:noVBand="0" w:val="0020"/>
+      </w:tblPr>
+      <w:tblGrid>
+        <w:gridCol w:w="2640"/>
+        <w:gridCol w:w="2640"/>
+        <w:gridCol w:w="2640"/>
+      </w:tblGrid>
+      <w:tr>
+        <w:trPr>
+          <w:tblHeader w:val="on"/>
+        </w:trPr>
+        <w:tc>
+          <w:tcPr/>
+          <w:p>
+            <w:pPr>
+              <w:pStyle w:val="Compact"/>
+            </w:pPr>
+            <w:r>
+              <w:t xml:space="preserve">Begriff</w:t>
+            </w:r>
+          </w:p>
+        </w:tc>
+        <w:tc>
+          <w:tcPr/>
+          <w:p>
+            <w:pPr>
+              <w:pStyle w:val="Compact"/>
+            </w:pPr>
+            <w:r>
+              <w:t xml:space="preserve">Variable</w:t>
+            </w:r>
+          </w:p>
+        </w:tc>
+        <w:tc>
+          <w:tcPr/>
+          <w:p>
+            <w:pPr>
+              <w:pStyle w:val="Compact"/>
+            </w:pPr>
+            <w:r>
+              <w:t xml:space="preserve">Bedeutung</w:t>
+            </w:r>
+          </w:p>
+        </w:tc>
+      </w:tr>
+      <w:tr>
+        <w:tc>
+          <w:tcPr/>
+          <w:p>
+            <w:pPr>
+              <w:pStyle w:val="Compact"/>
+            </w:pPr>
+            <w:r>
+              <w:t xml:space="preserve">Hintergrundlufttemperatur</w:t>
+            </w:r>
+          </w:p>
+        </w:tc>
+        <w:tc>
+          <w:tcPr/>
+          <w:p>
+            <w:pPr>
+              <w:pStyle w:val="Compact"/>
+            </w:pPr>
+            <w:r>
+              <w:rPr>
+                <w:rStyle w:val="VerbatimChar"/>
+              </w:rPr>
+              <w:t xml:space="preserve">air-temp</w:t>
+            </w:r>
+          </w:p>
+        </w:tc>
+        <w:tc>
+          <w:tcPr/>
+          <w:p>
+            <w:pPr>
+              <w:pStyle w:val="Compact"/>
+            </w:pPr>
+            <w:r>
+              <w:t xml:space="preserve">allgemeiner Tagesgang der Lufttemperatur, also der meteorologische Antrieb</w:t>
+            </w:r>
+          </w:p>
+        </w:tc>
+      </w:tr>
+      <w:tr>
+        <w:tc>
+          <w:tcPr/>
+          <w:p>
+            <w:pPr>
+              <w:pStyle w:val="Compact"/>
+            </w:pPr>
+            <w:r>
+              <w:t xml:space="preserve">lokale Lufttemperatur</w:t>
+            </w:r>
+          </w:p>
+        </w:tc>
+        <w:tc>
+          <w:tcPr/>
+          <w:p>
+            <w:pPr>
+              <w:pStyle w:val="Compact"/>
+            </w:pPr>
+            <w:r>
+              <w:rPr>
+                <w:rStyle w:val="VerbatimChar"/>
+              </w:rPr>
+              <w:t xml:space="preserve">air-temp-local</w:t>
+            </w:r>
+          </w:p>
+        </w:tc>
+        <w:tc>
+          <w:tcPr/>
+          <w:p>
+            <w:pPr>
+              <w:pStyle w:val="Compact"/>
+            </w:pPr>
+            <w:r>
+              <w:t xml:space="preserve">Lufttemperatur über einem bestimmten Patch des Schulhofs</w:t>
+            </w:r>
+          </w:p>
+        </w:tc>
+      </w:tr>
+      <w:tr>
+        <w:tc>
+          <w:tcPr/>
+          <w:p>
+            <w:pPr>
+              <w:pStyle w:val="Compact"/>
+            </w:pPr>
+            <w:r>
+              <w:t xml:space="preserve">Oberflächentemperatur</w:t>
+            </w:r>
+          </w:p>
+        </w:tc>
+        <w:tc>
+          <w:tcPr/>
+          <w:p>
+            <w:pPr>
+              <w:pStyle w:val="Compact"/>
+            </w:pPr>
+            <w:r>
+              <w:rPr>
+                <w:rStyle w:val="VerbatimChar"/>
+              </w:rPr>
+              <w:t xml:space="preserve">surface-temp</w:t>
+            </w:r>
+          </w:p>
+        </w:tc>
+        <w:tc>
+          <w:tcPr/>
+          <w:p>
+            <w:pPr>
+              <w:pStyle w:val="Compact"/>
+            </w:pPr>
+            <w:r>
+              <w:t xml:space="preserve">Temperatur der Oberfläche, zum Beispiel Asphalt, Rasen, Dach oder Sand</w:t>
+            </w:r>
+          </w:p>
+        </w:tc>
+      </w:tr>
+      <w:tr>
+        <w:tc>
+          <w:tcPr/>
+          <w:p>
+            <w:pPr>
+              <w:pStyle w:val="Compact"/>
+            </w:pPr>
+            <w:r>
+              <w:t xml:space="preserve">Substrattemperatur</w:t>
+            </w:r>
+          </w:p>
+        </w:tc>
+        <w:tc>
+          <w:tcPr/>
+          <w:p>
+            <w:pPr>
+              <w:pStyle w:val="Compact"/>
+            </w:pPr>
+            <w:r>
+              <w:rPr>
+                <w:rStyle w:val="VerbatimChar"/>
+              </w:rPr>
+              <w:t xml:space="preserve">substrate-temp</w:t>
+            </w:r>
+          </w:p>
+        </w:tc>
+        <w:tc>
+          <w:tcPr/>
+          <w:p>
+            <w:pPr>
+              <w:pStyle w:val="Compact"/>
+            </w:pPr>
+            <w:r>
+              <w:t xml:space="preserve">vereinfachter Wärmespeicher unter oder hinter der Oberfläche</w:t>
+            </w:r>
+          </w:p>
+        </w:tc>
+      </w:tr>
+    </w:tbl>
+    <w:p>
+      <w:pPr>
+        <w:pStyle w:val="BodyText"/>
+      </w:pPr>
+      <w:r>
+        <w:t xml:space="preserve">Diese Trennung ist zentral. Eine Oberfläche kann sehr heiß sein, ohne dass die Luft darüber genauso heiß ist. Asphalt kann zum Beispiel deutlich heißer werden als die lokale Luft. Die Luft reagiert verzögert, weil sie durch Wind, Mischung und Austausch mit der Umgebung beeinflusst wird.</w:t>
+      </w:r>
+    </w:p>
+    <w:bookmarkEnd w:id="23"/>
+    <w:bookmarkStart w:id="24" w:name="patch-fläche-und-objekt"/>
+    <w:p>
+      <w:pPr>
+        <w:pStyle w:val="Heading2"/>
+      </w:pPr>
+      <w:r>
+        <w:t xml:space="preserve">Patch, Fläche und Objekt</w:t>
+      </w:r>
+    </w:p>
+    <w:p>
+      <w:pPr>
+        <w:pStyle w:val="FirstParagraph"/>
+      </w:pPr>
+      <w:r>
+        <w:t xml:space="preserve">Der Schulhof besteht aus Rasterzellen. In NetLogo heißen diese Rasterzellen</w:t>
+      </w:r>
+      <w:r>
+        <w:t xml:space="preserve"> </w:t>
+      </w:r>
+      <w:r>
+        <w:rPr>
+          <w:rStyle w:val="VerbatimChar"/>
+        </w:rPr>
+        <w:t xml:space="preserve">patches</w:t>
+      </w:r>
+      <w:r>
+        <w:t xml:space="preserve">.</w:t>
+      </w:r>
+    </w:p>
+    <w:p>
+      <w:pPr>
+        <w:pStyle w:val="BodyText"/>
+      </w:pPr>
+      <w:r>
+        <w:t xml:space="preserve">Ein Patch kann zwei unterschiedliche Dinge besitzen:</w:t>
+      </w:r>
+    </w:p>
+    <w:tbl>
+      <w:tblPr>
+        <w:tblStyle w:val="Table"/>
+        <w:tblW w:type="pct" w:w="5000"/>
+        <w:tblLayout w:type="fixed"/>
+        <w:tblLook w:firstRow="1" w:lastRow="0" w:firstColumn="0" w:lastColumn="0" w:noHBand="0" w:noVBand="0" w:val="0020"/>
+      </w:tblPr>
+      <w:tblGrid>
+        <w:gridCol w:w="2640"/>
+        <w:gridCol w:w="2640"/>
+        <w:gridCol w:w="2640"/>
+      </w:tblGrid>
+      <w:tr>
+        <w:trPr>
+          <w:tblHeader w:val="on"/>
+        </w:trPr>
+        <w:tc>
+          <w:tcPr/>
+          <w:p>
+            <w:pPr>
+              <w:pStyle w:val="Compact"/>
+            </w:pPr>
+            <w:r>
+              <w:t xml:space="preserve">Ebene</w:t>
+            </w:r>
+          </w:p>
+        </w:tc>
+        <w:tc>
+          <w:tcPr/>
+          <w:p>
+            <w:pPr>
+              <w:pStyle w:val="Compact"/>
+            </w:pPr>
+            <w:r>
+              <w:t xml:space="preserve">Beispiel</w:t>
+            </w:r>
+          </w:p>
+        </w:tc>
+        <w:tc>
+          <w:tcPr/>
+          <w:p>
+            <w:pPr>
+              <w:pStyle w:val="Compact"/>
+            </w:pPr>
+            <w:r>
+              <w:t xml:space="preserve">Bedeutung</w:t>
+            </w:r>
+          </w:p>
+        </w:tc>
+      </w:tr>
+      <w:tr>
+        <w:tc>
+          <w:tcPr/>
+          <w:p>
+            <w:pPr>
+              <w:pStyle w:val="Compact"/>
+            </w:pPr>
+            <w:r>
+              <w:t xml:space="preserve">Boden</w:t>
+            </w:r>
+          </w:p>
+        </w:tc>
+        <w:tc>
+          <w:tcPr/>
+          <w:p>
+            <w:pPr>
+              <w:pStyle w:val="Compact"/>
+            </w:pPr>
+            <w:r>
+              <w:t xml:space="preserve">Asphalt, Pflaster, Rasen, Sand</w:t>
+            </w:r>
+          </w:p>
+        </w:tc>
+        <w:tc>
+          <w:tcPr/>
+          <w:p>
+            <w:pPr>
+              <w:pStyle w:val="Compact"/>
+            </w:pPr>
+            <w:r>
+              <w:t xml:space="preserve">Das Material der Fläche</w:t>
+            </w:r>
+          </w:p>
+        </w:tc>
+      </w:tr>
+      <w:tr>
+        <w:tc>
+          <w:tcPr/>
+          <w:p>
+            <w:pPr>
+              <w:pStyle w:val="Compact"/>
+            </w:pPr>
+            <w:r>
+              <w:t xml:space="preserve">Objekt</w:t>
+            </w:r>
+          </w:p>
+        </w:tc>
+        <w:tc>
+          <w:tcPr/>
+          <w:p>
+            <w:pPr>
+              <w:pStyle w:val="Compact"/>
+            </w:pPr>
+            <w:r>
+              <w:t xml:space="preserve">Baum, Hecke, Gebäude</w:t>
+            </w:r>
+          </w:p>
+        </w:tc>
+        <w:tc>
+          <w:tcPr/>
+          <w:p>
+            <w:pPr>
+              <w:pStyle w:val="Compact"/>
+            </w:pPr>
+            <w:r>
+              <w:t xml:space="preserve">Etwas, das auf der Fläche steht oder sie ersetzt</w:t>
+            </w:r>
+          </w:p>
+        </w:tc>
+      </w:tr>
+    </w:tbl>
+    <w:p>
+      <w:pPr>
+        <w:pStyle w:val="BodyText"/>
+      </w:pPr>
+      <w:r>
+        <w:t xml:space="preserve">Diese Trennung ist wichtig. Ein Baum ist nicht einfach Rasen. Ein Baum hat Höhe, wirft Schatten und beeinflusst seine Umgebung. Ein Gebäude ist nicht einfach eine graue Fläche. Es besitzt Dach, Wand, Höhe und Schattenwirkung.</w:t>
+      </w:r>
+    </w:p>
+    <w:bookmarkEnd w:id="24"/>
+    <w:bookmarkStart w:id="25" w:name="prozessgruppen-des-modells"/>
+    <w:p>
+      <w:pPr>
+        <w:pStyle w:val="Heading2"/>
+      </w:pPr>
+      <w:r>
+        <w:t xml:space="preserve">Prozessgruppen des Modells</w:t>
+      </w:r>
+    </w:p>
+    <w:p>
+      <w:pPr>
+        <w:pStyle w:val="FirstParagraph"/>
+      </w:pPr>
+      <w:r>
+        <w:t xml:space="preserve">Das Modell setzt sich aus mehreren Prozessgruppen zusammen.</w:t>
+      </w:r>
+    </w:p>
+    <w:tbl>
+      <w:tblPr>
+        <w:tblStyle w:val="Table"/>
+        <w:tblW w:type="pct" w:w="5000"/>
+        <w:tblLayout w:type="fixed"/>
+        <w:tblLook w:firstRow="1" w:lastRow="0" w:firstColumn="0" w:lastColumn="0" w:noHBand="0" w:noVBand="0" w:val="0020"/>
+      </w:tblPr>
+      <w:tblGrid>
+        <w:gridCol w:w="2640"/>
+        <w:gridCol w:w="2640"/>
+        <w:gridCol w:w="2640"/>
+      </w:tblGrid>
+      <w:tr>
+        <w:trPr>
+          <w:tblHeader w:val="on"/>
+        </w:trPr>
+        <w:tc>
+          <w:tcPr/>
+          <w:p>
+            <w:pPr>
+              <w:pStyle w:val="Compact"/>
+            </w:pPr>
+            <w:r>
+              <w:t xml:space="preserve">Prozessgruppe</w:t>
+            </w:r>
+          </w:p>
+        </w:tc>
+        <w:tc>
+          <w:tcPr/>
+          <w:p>
+            <w:pPr>
+              <w:pStyle w:val="Compact"/>
+            </w:pPr>
+            <w:r>
+              <w:t xml:space="preserve">Einfache Erklärung</w:t>
+            </w:r>
+          </w:p>
+        </w:tc>
+        <w:tc>
+          <w:tcPr/>
+          <w:p>
+            <w:pPr>
+              <w:pStyle w:val="Compact"/>
+            </w:pPr>
+            <w:r>
+              <w:t xml:space="preserve">Wirkung im Modell</w:t>
+            </w:r>
+          </w:p>
+        </w:tc>
+      </w:tr>
+      <w:tr>
+        <w:tc>
+          <w:tcPr/>
+          <w:p>
+            <w:pPr>
+              <w:pStyle w:val="Compact"/>
+            </w:pPr>
+            <w:r>
+              <w:t xml:space="preserve">kurzwellige Strahlung</w:t>
+            </w:r>
+          </w:p>
+        </w:tc>
+        <w:tc>
+          <w:tcPr/>
+          <w:p>
+            <w:pPr>
+              <w:pStyle w:val="Compact"/>
+            </w:pPr>
+            <w:r>
+              <w:t xml:space="preserve">Sonnenstrahlung trifft auf eine Oberfläche</w:t>
+            </w:r>
+          </w:p>
+        </w:tc>
+        <w:tc>
+          <w:tcPr/>
+          <w:p>
+            <w:pPr>
+              <w:pStyle w:val="Compact"/>
+            </w:pPr>
+            <w:r>
+              <w:t xml:space="preserve">erwärmt Oberflächen abhängig von Sonne, Schatten und Albedo</w:t>
+            </w:r>
+          </w:p>
+        </w:tc>
+      </w:tr>
+      <w:tr>
+        <w:tc>
+          <w:tcPr/>
+          <w:p>
+            <w:pPr>
+              <w:pStyle w:val="Compact"/>
+            </w:pPr>
+            <w:r>
+              <w:t xml:space="preserve">langwellige Strahlung</w:t>
+            </w:r>
+          </w:p>
+        </w:tc>
+        <w:tc>
+          <w:tcPr/>
+          <w:p>
+            <w:pPr>
+              <w:pStyle w:val="Compact"/>
+            </w:pPr>
+            <w:r>
+              <w:t xml:space="preserve">warme Oberflächen geben Wärmestrahlung ab</w:t>
+            </w:r>
+          </w:p>
+        </w:tc>
+        <w:tc>
+          <w:tcPr/>
+          <w:p>
+            <w:pPr>
+              <w:pStyle w:val="Compact"/>
+            </w:pPr>
+            <w:r>
+              <w:t xml:space="preserve">kann Oberflächen nachts abkühlen</w:t>
+            </w:r>
+          </w:p>
+        </w:tc>
+      </w:tr>
+      <w:tr>
+        <w:tc>
+          <w:tcPr/>
+          <w:p>
+            <w:pPr>
+              <w:pStyle w:val="Compact"/>
+            </w:pPr>
+            <w:r>
+              <w:t xml:space="preserve">Wärmespeicherung</w:t>
+            </w:r>
+          </w:p>
+        </w:tc>
+        <w:tc>
+          <w:tcPr/>
+          <w:p>
+            <w:pPr>
+              <w:pStyle w:val="Compact"/>
+            </w:pPr>
+            <w:r>
+              <w:t xml:space="preserve">Materialien speichern Wärme unterschiedlich stark</w:t>
+            </w:r>
+          </w:p>
+        </w:tc>
+        <w:tc>
+          <w:tcPr/>
+          <w:p>
+            <w:pPr>
+              <w:pStyle w:val="Compact"/>
+            </w:pPr>
+            <w:r>
+              <w:t xml:space="preserve">bestimmt, wie schnell Flächen warm oder kalt werden</w:t>
+            </w:r>
+          </w:p>
+        </w:tc>
+      </w:tr>
+      <w:tr>
+        <w:tc>
+          <w:tcPr/>
+          <w:p>
+            <w:pPr>
+              <w:pStyle w:val="Compact"/>
+            </w:pPr>
+            <w:r>
+              <w:t xml:space="preserve">fühlbarer Wärmefluss</w:t>
+            </w:r>
+          </w:p>
+        </w:tc>
+        <w:tc>
+          <w:tcPr/>
+          <w:p>
+            <w:pPr>
+              <w:pStyle w:val="Compact"/>
+            </w:pPr>
+            <w:r>
+              <w:t xml:space="preserve">Wärmeübergang zwischen Oberfläche und Luft</w:t>
+            </w:r>
+          </w:p>
+        </w:tc>
+        <w:tc>
+          <w:tcPr/>
+          <w:p>
+            <w:pPr>
+              <w:pStyle w:val="Compact"/>
+            </w:pPr>
+            <w:r>
+              <w:t xml:space="preserve">koppelt heiße Oberflächen an die lokale Luft</w:t>
+            </w:r>
+          </w:p>
+        </w:tc>
+      </w:tr>
+      <w:tr>
+        <w:tc>
+          <w:tcPr/>
+          <w:p>
+            <w:pPr>
+              <w:pStyle w:val="Compact"/>
+            </w:pPr>
+            <w:r>
+              <w:t xml:space="preserve">latenter Wärmefluss</w:t>
+            </w:r>
+          </w:p>
+        </w:tc>
+        <w:tc>
+          <w:tcPr/>
+          <w:p>
+            <w:pPr>
+              <w:pStyle w:val="Compact"/>
+            </w:pPr>
+            <w:r>
+              <w:t xml:space="preserve">Energieverlust durch Verdunstung</w:t>
+            </w:r>
+          </w:p>
+        </w:tc>
+        <w:tc>
+          <w:tcPr/>
+          <w:p>
+            <w:pPr>
+              <w:pStyle w:val="Compact"/>
+            </w:pPr>
+            <w:r>
+              <w:t xml:space="preserve">kühlt feuchte oder vegetationsnahe Flächen</w:t>
+            </w:r>
+          </w:p>
+        </w:tc>
+      </w:tr>
+      <w:tr>
+        <w:tc>
+          <w:tcPr/>
+          <w:p>
+            <w:pPr>
+              <w:pStyle w:val="Compact"/>
+            </w:pPr>
+            <w:r>
+              <w:t xml:space="preserve">Bodenwärmefluss</w:t>
+            </w:r>
+          </w:p>
+        </w:tc>
+        <w:tc>
+          <w:tcPr/>
+          <w:p>
+            <w:pPr>
+              <w:pStyle w:val="Compact"/>
+            </w:pPr>
+            <w:r>
+              <w:t xml:space="preserve">Wärme geht in einen vereinfachten Untergrundspeicher</w:t>
+            </w:r>
+          </w:p>
+        </w:tc>
+        <w:tc>
+          <w:tcPr/>
+          <w:p>
+            <w:pPr>
+              <w:pStyle w:val="Compact"/>
+            </w:pPr>
+            <w:r>
+              <w:t xml:space="preserve">puffert Erwärmung und Abkühlung</w:t>
+            </w:r>
+          </w:p>
+        </w:tc>
+      </w:tr>
+      <w:tr>
+        <w:tc>
+          <w:tcPr/>
+          <w:p>
+            <w:pPr>
+              <w:pStyle w:val="Compact"/>
+            </w:pPr>
+            <w:r>
+              <w:t xml:space="preserve">Luftmischung</w:t>
+            </w:r>
+          </w:p>
+        </w:tc>
+        <w:tc>
+          <w:tcPr/>
+          <w:p>
+            <w:pPr>
+              <w:pStyle w:val="Compact"/>
+            </w:pPr>
+            <w:r>
+              <w:t xml:space="preserve">lokale Luft wird mit Nachbarschaft und Hintergrundluft gemischt</w:t>
+            </w:r>
+          </w:p>
+        </w:tc>
+        <w:tc>
+          <w:tcPr/>
+          <w:p>
+            <w:pPr>
+              <w:pStyle w:val="Compact"/>
+            </w:pPr>
+            <w:r>
+              <w:t xml:space="preserve">verhindert, dass Lufttemperaturen sofort Oberflächentemperaturen werden</w:t>
+            </w:r>
+          </w:p>
+        </w:tc>
+      </w:tr>
+      <w:tr>
+        <w:tc>
+          <w:tcPr/>
+          <w:p>
+            <w:pPr>
+              <w:pStyle w:val="Compact"/>
+            </w:pPr>
+            <w:r>
+              <w:t xml:space="preserve">Schattenwurf</w:t>
+            </w:r>
+          </w:p>
+        </w:tc>
+        <w:tc>
+          <w:tcPr/>
+          <w:p>
+            <w:pPr>
+              <w:pStyle w:val="Compact"/>
+            </w:pPr>
+            <w:r>
+              <w:t xml:space="preserve">Gebäude und Vegetation schirmen direkte Sonne ab</w:t>
+            </w:r>
+          </w:p>
+        </w:tc>
+        <w:tc>
+          <w:tcPr/>
+          <w:p>
+            <w:pPr>
+              <w:pStyle w:val="Compact"/>
+            </w:pPr>
+            <w:r>
+              <w:t xml:space="preserve">reduziert solare Aufheizung</w:t>
+            </w:r>
+          </w:p>
+        </w:tc>
+      </w:tr>
+      <w:tr>
+        <w:tc>
+          <w:tcPr/>
+          <w:p>
+            <w:pPr>
+              <w:pStyle w:val="Compact"/>
+            </w:pPr>
+            <w:r>
+              <w:t xml:space="preserve">Hitzelast</w:t>
+            </w:r>
+          </w:p>
+        </w:tc>
+        <w:tc>
+          <w:tcPr/>
+          <w:p>
+            <w:pPr>
+              <w:pStyle w:val="Compact"/>
+            </w:pPr>
+            <w:r>
+              <w:t xml:space="preserve">vereinfachte Aufenthaltsbelastung für Menschen</w:t>
+            </w:r>
+          </w:p>
+        </w:tc>
+        <w:tc>
+          <w:tcPr/>
+          <w:p>
+            <w:pPr>
+              <w:pStyle w:val="Compact"/>
+            </w:pPr>
+            <w:r>
+              <w:t xml:space="preserve">fasst Luft, Sonne, Oberflächenwärme, Wind und Vegetation zusammen</w:t>
+            </w:r>
+          </w:p>
+        </w:tc>
+      </w:tr>
+    </w:tbl>
+    <w:bookmarkEnd w:id="25"/>
+    <w:bookmarkStart w:id="26" w:name="harte-und-weichere-modellteile"/>
+    <w:p>
+      <w:pPr>
+        <w:pStyle w:val="Heading2"/>
+      </w:pPr>
+      <w:r>
+        <w:t xml:space="preserve">Harte und weichere Modellteile</w:t>
+      </w:r>
+    </w:p>
+    <w:p>
+      <w:pPr>
+        <w:pStyle w:val="FirstParagraph"/>
+      </w:pPr>
+      <w:r>
+        <w:t xml:space="preserve">Nicht alle Teile des Modells sind gleich hart.</w:t>
+      </w:r>
+    </w:p>
+    <w:tbl>
+      <w:tblPr>
+        <w:tblStyle w:val="Table"/>
+        <w:tblW w:type="pct" w:w="5000"/>
+        <w:tblLayout w:type="fixed"/>
+        <w:tblLook w:firstRow="1" w:lastRow="0" w:firstColumn="0" w:lastColumn="0" w:noHBand="0" w:noVBand="0" w:val="0020"/>
+      </w:tblPr>
+      <w:tblGrid>
+        <w:gridCol w:w="2640"/>
+        <w:gridCol w:w="2640"/>
+        <w:gridCol w:w="2640"/>
+      </w:tblGrid>
+      <w:tr>
+        <w:trPr>
+          <w:tblHeader w:val="on"/>
+        </w:trPr>
+        <w:tc>
+          <w:tcPr/>
+          <w:p>
+            <w:pPr>
+              <w:pStyle w:val="Compact"/>
+            </w:pPr>
+            <w:r>
+              <w:t xml:space="preserve">Modellteil</w:t>
+            </w:r>
+          </w:p>
+        </w:tc>
+        <w:tc>
+          <w:tcPr/>
+          <w:p>
+            <w:pPr>
+              <w:pStyle w:val="Compact"/>
+            </w:pPr>
+            <w:r>
+              <w:t xml:space="preserve">Einordnung</w:t>
+            </w:r>
+          </w:p>
+        </w:tc>
+        <w:tc>
+          <w:tcPr/>
+          <w:p>
+            <w:pPr>
+              <w:pStyle w:val="Compact"/>
+            </w:pPr>
+            <w:r>
+              <w:t xml:space="preserve">Begründung</w:t>
+            </w:r>
+          </w:p>
+        </w:tc>
+      </w:tr>
+      <w:tr>
+        <w:tc>
+          <w:tcPr/>
+          <w:p>
+            <w:pPr>
+              <w:pStyle w:val="Compact"/>
+            </w:pPr>
+            <w:r>
+              <w:t xml:space="preserve">Materialunterschiede</w:t>
+            </w:r>
+          </w:p>
+        </w:tc>
+        <w:tc>
+          <w:tcPr/>
+          <w:p>
+            <w:pPr>
+              <w:pStyle w:val="Compact"/>
+            </w:pPr>
+            <w:r>
+              <w:t xml:space="preserve">relativ stark begründet</w:t>
+            </w:r>
+          </w:p>
+        </w:tc>
+        <w:tc>
+          <w:tcPr/>
+          <w:p>
+            <w:pPr>
+              <w:pStyle w:val="Compact"/>
+            </w:pPr>
+            <w:r>
+              <w:t xml:space="preserve">Albedo, Verdunstung, Wärmespeicherung und Oberfläche werden getrennt modelliert</w:t>
+            </w:r>
+          </w:p>
+        </w:tc>
+      </w:tr>
+      <w:tr>
+        <w:tc>
+          <w:tcPr/>
+          <w:p>
+            <w:pPr>
+              <w:pStyle w:val="Compact"/>
+            </w:pPr>
+            <w:r>
+              <w:t xml:space="preserve">Schattenwirkung</w:t>
+            </w:r>
+          </w:p>
+        </w:tc>
+        <w:tc>
+          <w:tcPr/>
+          <w:p>
+            <w:pPr>
+              <w:pStyle w:val="Compact"/>
+            </w:pPr>
+            <w:r>
+              <w:t xml:space="preserve">relativ stark begründet</w:t>
+            </w:r>
+          </w:p>
+        </w:tc>
+        <w:tc>
+          <w:tcPr/>
+          <w:p>
+            <w:pPr>
+              <w:pStyle w:val="Compact"/>
+            </w:pPr>
+            <w:r>
+              <w:t xml:space="preserve">Schatten reduziert direkte Einstrahlung geometrisch</w:t>
+            </w:r>
+          </w:p>
+        </w:tc>
+      </w:tr>
+      <w:tr>
+        <w:tc>
+          <w:tcPr/>
+          <w:p>
+            <w:pPr>
+              <w:pStyle w:val="Compact"/>
+            </w:pPr>
+            <w:r>
+              <w:t xml:space="preserve">Oberflächentemperatur</w:t>
+            </w:r>
+          </w:p>
+        </w:tc>
+        <w:tc>
+          <w:tcPr/>
+          <w:p>
+            <w:pPr>
+              <w:pStyle w:val="Compact"/>
+            </w:pPr>
+            <w:r>
+              <w:t xml:space="preserve">stark vereinfacht, aber physikalisch strukturiert</w:t>
+            </w:r>
+          </w:p>
+        </w:tc>
+        <w:tc>
+          <w:tcPr/>
+          <w:p>
+            <w:pPr>
+              <w:pStyle w:val="Compact"/>
+            </w:pPr>
+            <w:r>
+              <w:t xml:space="preserve">vereinfachte Energiebilanz mit Strahlung, Wärmefluss, Verdunstung und Speicher</w:t>
+            </w:r>
+          </w:p>
+        </w:tc>
+      </w:tr>
+      <w:tr>
+        <w:tc>
+          <w:tcPr/>
+          <w:p>
+            <w:pPr>
+              <w:pStyle w:val="Compact"/>
+            </w:pPr>
+            <w:r>
+              <w:t xml:space="preserve">lokale Lufttemperatur</w:t>
+            </w:r>
+          </w:p>
+        </w:tc>
+        <w:tc>
+          <w:tcPr/>
+          <w:p>
+            <w:pPr>
+              <w:pStyle w:val="Compact"/>
+            </w:pPr>
+            <w:r>
+              <w:t xml:space="preserve">stärker parametrisiert</w:t>
+            </w:r>
+          </w:p>
+        </w:tc>
+        <w:tc>
+          <w:tcPr/>
+          <w:p>
+            <w:pPr>
+              <w:pStyle w:val="Compact"/>
+            </w:pPr>
+            <w:r>
+              <w:t xml:space="preserve">keine echte 3D-Strömung, sondern Kopplung, Mischung und Austausch</w:t>
+            </w:r>
+          </w:p>
+        </w:tc>
+      </w:tr>
+      <w:tr>
+        <w:tc>
+          <w:tcPr/>
+          <w:p>
+            <w:pPr>
+              <w:pStyle w:val="Compact"/>
+            </w:pPr>
+            <w:r>
+              <w:t xml:space="preserve">Vegetationswirkung</w:t>
+            </w:r>
+          </w:p>
+        </w:tc>
+        <w:tc>
+          <w:tcPr/>
+          <w:p>
+            <w:pPr>
+              <w:pStyle w:val="Compact"/>
+            </w:pPr>
+            <w:r>
+              <w:t xml:space="preserve">plausibel, aber parametrisiert</w:t>
+            </w:r>
+          </w:p>
+        </w:tc>
+        <w:tc>
+          <w:tcPr/>
+          <w:p>
+            <w:pPr>
+              <w:pStyle w:val="Compact"/>
+            </w:pPr>
+            <w:r>
+              <w:t xml:space="preserve">Schatten und Verdunstung werden abgebildet, aber keine echte Pflanzenphysiologie</w:t>
+            </w:r>
+          </w:p>
+        </w:tc>
+      </w:tr>
+      <w:tr>
+        <w:tc>
+          <w:tcPr/>
+          <w:p>
+            <w:pPr>
+              <w:pStyle w:val="Compact"/>
+            </w:pPr>
+            <w:r>
+              <w:t xml:space="preserve">Fassadenbegrünung</w:t>
+            </w:r>
+          </w:p>
+        </w:tc>
+        <w:tc>
+          <w:tcPr/>
+          <w:p>
+            <w:pPr>
+              <w:pStyle w:val="Compact"/>
+            </w:pPr>
+            <w:r>
+              <w:t xml:space="preserve">plausibel, aber stark parametrisiert</w:t>
+            </w:r>
+          </w:p>
+        </w:tc>
+        <w:tc>
+          <w:tcPr/>
+          <w:p>
+            <w:pPr>
+              <w:pStyle w:val="Compact"/>
+            </w:pPr>
+            <w:r>
+              <w:t xml:space="preserve">lokale Wandwirkung und ET-Kühlung, aber keine echte Fassadenströmung</w:t>
+            </w:r>
+          </w:p>
+        </w:tc>
+      </w:tr>
+      <w:tr>
+        <w:tc>
+          <w:tcPr/>
+          <w:p>
+            <w:pPr>
+              <w:pStyle w:val="Compact"/>
+            </w:pPr>
+            <w:r>
+              <w:t xml:space="preserve">Hitzelastindex</w:t>
+            </w:r>
+          </w:p>
+        </w:tc>
+        <w:tc>
+          <w:tcPr/>
+          <w:p>
+            <w:pPr>
+              <w:pStyle w:val="Compact"/>
+            </w:pPr>
+            <w:r>
+              <w:t xml:space="preserve">didaktischer Proxy</w:t>
+            </w:r>
+          </w:p>
+        </w:tc>
+        <w:tc>
+          <w:tcPr/>
+          <w:p>
+            <w:pPr>
+              <w:pStyle w:val="Compact"/>
+            </w:pPr>
+            <w:r>
+              <w:t xml:space="preserve">kein UTCI, PET oder medizinischer Grenzwert</w:t>
+            </w:r>
+          </w:p>
+        </w:tc>
+      </w:tr>
+    </w:tbl>
+    <w:p>
+      <w:pPr>
+        <w:pStyle w:val="BodyText"/>
+      </w:pPr>
+      <w:r>
+        <w:t xml:space="preserve">Kurz gesagt: Die Modellphysik ist besonders belastbar für</w:t>
+      </w:r>
+      <w:r>
+        <w:t xml:space="preserve"> </w:t>
+      </w:r>
+      <w:r>
+        <w:rPr>
+          <w:b/>
+          <w:bCs/>
+        </w:rPr>
+        <w:t xml:space="preserve">relative Wirkungsvergleiche</w:t>
+      </w:r>
+      <w:r>
+        <w:t xml:space="preserve">, weniger für</w:t>
+      </w:r>
+      <w:r>
+        <w:t xml:space="preserve"> </w:t>
+      </w:r>
+      <w:r>
+        <w:rPr>
+          <w:b/>
+          <w:bCs/>
+        </w:rPr>
+        <w:t xml:space="preserve">absolute Zahlenwerte</w:t>
+      </w:r>
+      <w:r>
+        <w:t xml:space="preserve">.</w:t>
+      </w:r>
+    </w:p>
+    <w:bookmarkEnd w:id="26"/>
+    <w:bookmarkEnd w:id="27"/>
+    <w:bookmarkStart w:id="28" w:name="glossar-zentraler-modellgrößen"/>
     <w:p>
       <w:pPr>
         <w:pStyle w:val="Heading1"/>
       </w:pPr>
       <w:r>
+        <w:t xml:space="preserve">Glossar zentraler Modellgrößen</w:t>
+      </w:r>
+    </w:p>
+    <w:p>
+      <w:pPr>
+        <w:pStyle w:val="FirstParagraph"/>
+      </w:pPr>
+      <w:r>
+        <w:t xml:space="preserve">Die folgenden Begriffe tauchen in der Dokumentation mehrfach auf.</w:t>
+      </w:r>
+    </w:p>
+    <w:tbl>
+      <w:tblPr>
+        <w:tblStyle w:val="Table"/>
+        <w:tblW w:type="pct" w:w="5000"/>
+        <w:tblLayout w:type="fixed"/>
+        <w:tblLook w:firstRow="1" w:lastRow="0" w:firstColumn="0" w:lastColumn="0" w:noHBand="0" w:noVBand="0" w:val="0020"/>
+      </w:tblPr>
+      <w:tblGrid>
+        <w:gridCol w:w="3960"/>
+        <w:gridCol w:w="3960"/>
+      </w:tblGrid>
+      <w:tr>
+        <w:trPr>
+          <w:tblHeader w:val="on"/>
+        </w:trPr>
+        <w:tc>
+          <w:tcPr/>
+          <w:p>
+            <w:pPr>
+              <w:pStyle w:val="Compact"/>
+            </w:pPr>
+            <w:r>
+              <w:t xml:space="preserve">Begriff</w:t>
+            </w:r>
+          </w:p>
+        </w:tc>
+        <w:tc>
+          <w:tcPr/>
+          <w:p>
+            <w:pPr>
+              <w:pStyle w:val="Compact"/>
+            </w:pPr>
+            <w:r>
+              <w:t xml:space="preserve">Bedeutung im Modell</w:t>
+            </w:r>
+          </w:p>
+        </w:tc>
+      </w:tr>
+      <w:tr>
+        <w:tc>
+          <w:tcPr/>
+          <w:p>
+            <w:pPr>
+              <w:pStyle w:val="Compact"/>
+            </w:pPr>
+            <w:r>
+              <w:t xml:space="preserve">Albedo</w:t>
+            </w:r>
+          </w:p>
+        </w:tc>
+        <w:tc>
+          <w:tcPr/>
+          <w:p>
+            <w:pPr>
+              <w:pStyle w:val="Compact"/>
+            </w:pPr>
+            <w:r>
+              <w:t xml:space="preserve">Anteil der Sonnenstrahlung, der reflektiert wird. Niedrige Albedo bedeutet starke Absorption und stärkere Erwärmung.</w:t>
+            </w:r>
+          </w:p>
+        </w:tc>
+      </w:tr>
+      <w:tr>
+        <w:tc>
+          <w:tcPr/>
+          <w:p>
+            <w:pPr>
+              <w:pStyle w:val="Compact"/>
+            </w:pPr>
+            <w:r>
+              <w:t xml:space="preserve">Emissivität</w:t>
+            </w:r>
+          </w:p>
+        </w:tc>
+        <w:tc>
+          <w:tcPr/>
+          <w:p>
+            <w:pPr>
+              <w:pStyle w:val="Compact"/>
+            </w:pPr>
+            <w:r>
+              <w:t xml:space="preserve">Fähigkeit einer Oberfläche, langwellige Wärmestrahlung abzugeben.</w:t>
+            </w:r>
+          </w:p>
+        </w:tc>
+      </w:tr>
+      <w:tr>
+        <w:tc>
+          <w:tcPr/>
+          <w:p>
+            <w:pPr>
+              <w:pStyle w:val="Compact"/>
+            </w:pPr>
+            <w:r>
+              <w:t xml:space="preserve">thermische Masse</w:t>
+            </w:r>
+          </w:p>
+        </w:tc>
+        <w:tc>
+          <w:tcPr/>
+          <w:p>
+            <w:pPr>
+              <w:pStyle w:val="Compact"/>
+            </w:pPr>
+            <w:r>
+              <w:t xml:space="preserve">effektive Trägheit einer Oberfläche. Hohe Werte bedeuten: Die Fläche reagiert langsamer auf Erwärmung und Abkühlung.</w:t>
+            </w:r>
+          </w:p>
+        </w:tc>
+      </w:tr>
+      <w:tr>
+        <w:tc>
+          <w:tcPr/>
+          <w:p>
+            <w:pPr>
+              <w:pStyle w:val="Compact"/>
+            </w:pPr>
+            <w:r>
+              <w:t xml:space="preserve">Verdunstungsfaktor</w:t>
+            </w:r>
+          </w:p>
+        </w:tc>
+        <w:tc>
+          <w:tcPr/>
+          <w:p>
+            <w:pPr>
+              <w:pStyle w:val="Compact"/>
+            </w:pPr>
+            <w:r>
+              <w:t xml:space="preserve">modellinterne Fähigkeit einer Fläche, über Wasserverdunstung Energie abzuführen.</w:t>
+            </w:r>
+          </w:p>
+        </w:tc>
+      </w:tr>
+      <w:tr>
+        <w:tc>
+          <w:tcPr/>
+          <w:p>
+            <w:pPr>
+              <w:pStyle w:val="Compact"/>
+            </w:pPr>
+            <w:r>
+              <w:t xml:space="preserve">Wasserspeicher</w:t>
+            </w:r>
+          </w:p>
+        </w:tc>
+        <w:tc>
+          <w:tcPr/>
+          <w:p>
+            <w:pPr>
+              <w:pStyle w:val="Compact"/>
+            </w:pPr>
+            <w:r>
+              <w:t xml:space="preserve">vereinfachter Speicher, aus dem Verdunstung versorgt wird. Ohne Wasser keine relevante Verdunstung.</w:t>
+            </w:r>
+          </w:p>
+        </w:tc>
+      </w:tr>
+      <w:tr>
+        <w:tc>
+          <w:tcPr/>
+          <w:p>
+            <w:pPr>
+              <w:pStyle w:val="Compact"/>
+            </w:pPr>
+            <w:r>
+              <w:t xml:space="preserve">Feuchtefaktor</w:t>
+            </w:r>
+          </w:p>
+        </w:tc>
+        <w:tc>
+          <w:tcPr/>
+          <w:p>
+            <w:pPr>
+              <w:pStyle w:val="Compact"/>
+            </w:pPr>
+            <w:r>
+              <w:t xml:space="preserve">beschreibt, wie stark eine feuchte Oberfläche tatsächlich verdunstungswirksam ist.</w:t>
+            </w:r>
+          </w:p>
+        </w:tc>
+      </w:tr>
+      <w:tr>
+        <w:tc>
+          <w:tcPr/>
+          <w:p>
+            <w:pPr>
+              <w:pStyle w:val="Compact"/>
+            </w:pPr>
+            <w:r>
+              <w:t xml:space="preserve">Wasserverfügbarkeit</w:t>
+            </w:r>
+          </w:p>
+        </w:tc>
+        <w:tc>
+          <w:tcPr/>
+          <w:p>
+            <w:pPr>
+              <w:pStyle w:val="Compact"/>
+            </w:pPr>
+            <w:r>
+              <w:t xml:space="preserve">aktueller Zustand des Wasserspeichers. Hohe Werte bedeuten: Verdunstung ist möglich.</w:t>
+            </w:r>
+          </w:p>
+        </w:tc>
+      </w:tr>
+      <w:tr>
+        <w:tc>
+          <w:tcPr/>
+          <w:p>
+            <w:pPr>
+              <w:pStyle w:val="Compact"/>
+            </w:pPr>
+            <w:r>
+              <w:t xml:space="preserve">Schattenlevel</w:t>
+            </w:r>
+          </w:p>
+        </w:tc>
+        <w:tc>
+          <w:tcPr/>
+          <w:p>
+            <w:pPr>
+              <w:pStyle w:val="Compact"/>
+            </w:pPr>
+            <w:r>
+              <w:t xml:space="preserve">Anteil der Abschirmung direkter Sonne auf einem Patch.</w:t>
+            </w:r>
+          </w:p>
+        </w:tc>
+      </w:tr>
+      <w:tr>
+        <w:tc>
+          <w:tcPr/>
+          <w:p>
+            <w:pPr>
+              <w:pStyle w:val="Compact"/>
+            </w:pPr>
+            <w:r>
+              <w:t xml:space="preserve">Vegetationseinfluss</w:t>
+            </w:r>
+          </w:p>
+        </w:tc>
+        <w:tc>
+          <w:tcPr/>
+          <w:p>
+            <w:pPr>
+              <w:pStyle w:val="Compact"/>
+            </w:pPr>
+            <w:r>
+              <w:t xml:space="preserve">Wirkung von Bäumen und Hecken in der Umgebung eines Patches.</w:t>
+            </w:r>
+          </w:p>
+        </w:tc>
+      </w:tr>
+      <w:tr>
+        <w:tc>
+          <w:tcPr/>
+          <w:p>
+            <w:pPr>
+              <w:pStyle w:val="Compact"/>
+            </w:pPr>
+            <w:r>
+              <w:t xml:space="preserve">Wandexposition</w:t>
+            </w:r>
+          </w:p>
+        </w:tc>
+        <w:tc>
+          <w:tcPr/>
+          <w:p>
+            <w:pPr>
+              <w:pStyle w:val="Compact"/>
+            </w:pPr>
+            <w:r>
+              <w:t xml:space="preserve">beschreibt, wie stark ein Patch durch benachbarte Gebäudewände beeinflusst wird.</w:t>
+            </w:r>
+          </w:p>
+        </w:tc>
+      </w:tr>
+      <w:tr>
+        <w:tc>
+          <w:tcPr/>
+          <w:p>
+            <w:pPr>
+              <w:pStyle w:val="Compact"/>
+            </w:pPr>
+            <w:r>
+              <w:t xml:space="preserve">Einfassung</w:t>
+            </w:r>
+          </w:p>
+        </w:tc>
+        <w:tc>
+          <w:tcPr/>
+          <w:p>
+            <w:pPr>
+              <w:pStyle w:val="Compact"/>
+            </w:pPr>
+            <w:r>
+              <w:t xml:space="preserve">beschreibt, wie stark ein Ort durch Gebäude und Hecken räumlich eingeschlossen ist.</w:t>
+            </w:r>
+          </w:p>
+        </w:tc>
+      </w:tr>
+      <w:tr>
+        <w:tc>
+          <w:tcPr/>
+          <w:p>
+            <w:pPr>
+              <w:pStyle w:val="Compact"/>
+            </w:pPr>
+            <w:r>
+              <w:t xml:space="preserve">Oberflächen-Footprint</w:t>
+            </w:r>
+          </w:p>
+        </w:tc>
+        <w:tc>
+          <w:tcPr/>
+          <w:p>
+            <w:pPr>
+              <w:pStyle w:val="Compact"/>
+            </w:pPr>
+            <w:r>
+              <w:t xml:space="preserve">Mischung aus eigener Oberfläche und Nachbaroberflächen, die auf die lokale Luft wirkt.</w:t>
+            </w:r>
+          </w:p>
+        </w:tc>
+      </w:tr>
+      <w:tr>
+        <w:tc>
+          <w:tcPr/>
+          <w:p>
+            <w:pPr>
+              <w:pStyle w:val="Compact"/>
+            </w:pPr>
+            <w:r>
+              <w:t xml:space="preserve">Hitzelast</w:t>
+            </w:r>
+          </w:p>
+        </w:tc>
+        <w:tc>
+          <w:tcPr/>
+          <w:p>
+            <w:pPr>
+              <w:pStyle w:val="Compact"/>
+            </w:pPr>
+            <w:r>
+              <w:t xml:space="preserve">vereinfachter Belastungswert für den Aufenthalt auf dem Schulhof.</w:t>
+            </w:r>
+          </w:p>
+        </w:tc>
+      </w:tr>
+      <w:tr>
+        <w:tc>
+          <w:tcPr/>
+          <w:p>
+            <w:pPr>
+              <w:pStyle w:val="Compact"/>
+            </w:pPr>
+            <w:r>
+              <w:t xml:space="preserve">Hitzedosis</w:t>
+            </w:r>
+          </w:p>
+        </w:tc>
+        <w:tc>
+          <w:tcPr/>
+          <w:p>
+            <w:pPr>
+              <w:pStyle w:val="Compact"/>
+            </w:pPr>
+            <w:r>
+              <w:t xml:space="preserve">über die Schulzeit aufsummierte Hitzelast.</w:t>
+            </w:r>
+          </w:p>
+        </w:tc>
+      </w:tr>
+      <w:tr>
+        <w:tc>
+          <w:tcPr/>
+          <w:p>
+            <w:pPr>
+              <w:pStyle w:val="Compact"/>
+            </w:pPr>
+            <w:r>
+              <w:t xml:space="preserve">Aufenthaltsfläche</w:t>
+            </w:r>
+          </w:p>
+        </w:tc>
+        <w:tc>
+          <w:tcPr/>
+          <w:p>
+            <w:pPr>
+              <w:pStyle w:val="Compact"/>
+            </w:pPr>
+            <w:r>
+              <w:t xml:space="preserve">begehbare oder nutzbare Fläche ohne Gebäude, Baum oder Hecke.</w:t>
+            </w:r>
+          </w:p>
+        </w:tc>
+      </w:tr>
+    </w:tbl>
+    <w:bookmarkEnd w:id="28"/>
+    <w:bookmarkStart w:id="29" w:name="einheiten-und-skalen"/>
+    <w:p>
+      <w:pPr>
+        <w:pStyle w:val="Heading1"/>
+      </w:pPr>
+      <w:r>
+        <w:t xml:space="preserve">Einheiten und Skalen</w:t>
+      </w:r>
+    </w:p>
+    <w:p>
+      <w:pPr>
+        <w:pStyle w:val="FirstParagraph"/>
+      </w:pPr>
+      <w:r>
+        <w:t xml:space="preserve">Viele Modellgrößen sind nicht direkt als Messwerte zu verstehen, sondern als effektive Modellgrößen. Trotzdem folgen sie einer klaren Skalenlogik.</w:t>
+      </w:r>
+    </w:p>
+    <w:tbl>
+      <w:tblPr>
+        <w:tblStyle w:val="Table"/>
+        <w:tblW w:type="pct" w:w="5000"/>
+        <w:tblLayout w:type="fixed"/>
+        <w:tblLook w:firstRow="1" w:lastRow="0" w:firstColumn="0" w:lastColumn="0" w:noHBand="0" w:noVBand="0" w:val="0020"/>
+      </w:tblPr>
+      <w:tblGrid>
+        <w:gridCol w:w="2640"/>
+        <w:gridCol w:w="2640"/>
+        <w:gridCol w:w="2640"/>
+      </w:tblGrid>
+      <w:tr>
+        <w:trPr>
+          <w:tblHeader w:val="on"/>
+        </w:trPr>
+        <w:tc>
+          <w:tcPr/>
+          <w:p>
+            <w:pPr>
+              <w:pStyle w:val="Compact"/>
+            </w:pPr>
+            <w:r>
+              <w:t xml:space="preserve">Größe</w:t>
+            </w:r>
+          </w:p>
+        </w:tc>
+        <w:tc>
+          <w:tcPr/>
+          <w:p>
+            <w:pPr>
+              <w:pStyle w:val="Compact"/>
+            </w:pPr>
+            <w:r>
+              <w:t xml:space="preserve">Einheit oder Skala</w:t>
+            </w:r>
+          </w:p>
+        </w:tc>
+        <w:tc>
+          <w:tcPr/>
+          <w:p>
+            <w:pPr>
+              <w:pStyle w:val="Compact"/>
+            </w:pPr>
+            <w:r>
+              <w:t xml:space="preserve">Interpretation</w:t>
+            </w:r>
+          </w:p>
+        </w:tc>
+      </w:tr>
+      <w:tr>
+        <w:tc>
+          <w:tcPr/>
+          <w:p>
+            <w:pPr>
+              <w:pStyle w:val="Compact"/>
+            </w:pPr>
+            <w:r>
+              <w:t xml:space="preserve">Temperatur</w:t>
+            </w:r>
+          </w:p>
+        </w:tc>
+        <w:tc>
+          <w:tcPr/>
+          <w:p>
+            <w:pPr>
+              <w:pStyle w:val="Compact"/>
+            </w:pPr>
+            <w:r>
+              <w:t xml:space="preserve">°C</w:t>
+            </w:r>
+          </w:p>
+        </w:tc>
+        <w:tc>
+          <w:tcPr/>
+          <w:p>
+            <w:pPr>
+              <w:pStyle w:val="Compact"/>
+            </w:pPr>
+            <w:r>
+              <w:t xml:space="preserve">Luft-, Oberflächen- oder Substrattemperatur</w:t>
+            </w:r>
+          </w:p>
+        </w:tc>
+      </w:tr>
+      <w:tr>
+        <w:tc>
+          <w:tcPr/>
+          <w:p>
+            <w:pPr>
+              <w:pStyle w:val="Compact"/>
+            </w:pPr>
+            <w:r>
+              <w:t xml:space="preserve">Zeit</w:t>
+            </w:r>
+          </w:p>
+        </w:tc>
+        <w:tc>
+          <w:tcPr/>
+          <w:p>
+            <w:pPr>
+              <w:pStyle w:val="Compact"/>
+            </w:pPr>
+            <w:r>
+              <w:t xml:space="preserve">h</w:t>
+            </w:r>
+          </w:p>
+        </w:tc>
+        <w:tc>
+          <w:tcPr/>
+          <w:p>
+            <w:pPr>
+              <w:pStyle w:val="Compact"/>
+            </w:pPr>
+            <w:r>
+              <w:t xml:space="preserve">Modellzeit in Stunden</w:t>
+            </w:r>
+          </w:p>
+        </w:tc>
+      </w:tr>
+      <w:tr>
+        <w:tc>
+          <w:tcPr/>
+          <w:p>
+            <w:pPr>
+              <w:pStyle w:val="Compact"/>
+            </w:pPr>
+            <w:r>
+              <w:t xml:space="preserve">interner Zeitschritt</w:t>
+            </w:r>
+          </w:p>
+        </w:tc>
+        <w:tc>
+          <w:tcPr/>
+          <w:p>
+            <w:pPr>
+              <w:pStyle w:val="Compact"/>
+            </w:pPr>
+            <w:r>
+              <w:t xml:space="preserve">h</w:t>
+            </w:r>
+          </w:p>
+        </w:tc>
+        <w:tc>
+          <w:tcPr/>
+          <w:p>
+            <w:pPr>
+              <w:pStyle w:val="Compact"/>
+            </w:pPr>
+            <w:r>
+              <w:t xml:space="preserve">0.25 h entspricht 15 Minuten</w:t>
+            </w:r>
+          </w:p>
+        </w:tc>
+      </w:tr>
+      <w:tr>
+        <w:tc>
+          <w:tcPr/>
+          <w:p>
+            <w:pPr>
+              <w:pStyle w:val="Compact"/>
+            </w:pPr>
+            <w:r>
+              <w:t xml:space="preserve">Strahlungs- und Wärmeflüsse</w:t>
+            </w:r>
+          </w:p>
+        </w:tc>
+        <w:tc>
+          <w:tcPr/>
+          <w:p>
+            <w:pPr>
+              <w:pStyle w:val="Compact"/>
+            </w:pPr>
+            <w:r>
+              <w:t xml:space="preserve">modelllogisch W/m²</w:t>
+            </w:r>
+          </w:p>
+        </w:tc>
+        <w:tc>
+          <w:tcPr/>
+          <w:p>
+            <w:pPr>
+              <w:pStyle w:val="Compact"/>
+            </w:pPr>
+            <w:r>
+              <w:t xml:space="preserve">Energiefluss pro Fläche</w:t>
+            </w:r>
+          </w:p>
+        </w:tc>
+      </w:tr>
+      <w:tr>
+        <w:tc>
+          <w:tcPr/>
+          <w:p>
+            <w:pPr>
+              <w:pStyle w:val="Compact"/>
+            </w:pPr>
+            <w:r>
+              <w:t xml:space="preserve">Wasserspeicher</w:t>
+            </w:r>
+          </w:p>
+        </w:tc>
+        <w:tc>
+          <w:tcPr/>
+          <w:p>
+            <w:pPr>
+              <w:pStyle w:val="Compact"/>
+            </w:pPr>
+            <w:r>
+              <w:t xml:space="preserve">mm</w:t>
+            </w:r>
+          </w:p>
+        </w:tc>
+        <w:tc>
+          <w:tcPr/>
+          <w:p>
+            <w:pPr>
+              <w:pStyle w:val="Compact"/>
+            </w:pPr>
+            <w:r>
+              <w:t xml:space="preserve">vereinfachte Wasserhöhe im Patchspeicher</w:t>
+            </w:r>
+          </w:p>
+        </w:tc>
+      </w:tr>
+      <w:tr>
+        <w:tc>
+          <w:tcPr/>
+          <w:p>
+            <w:pPr>
+              <w:pStyle w:val="Compact"/>
+            </w:pPr>
+            <w:r>
+              <w:t xml:space="preserve">Albedo</w:t>
+            </w:r>
+          </w:p>
+        </w:tc>
+        <w:tc>
+          <w:tcPr/>
+          <w:p>
+            <w:pPr>
+              <w:pStyle w:val="Compact"/>
+            </w:pPr>
+            <w:r>
+              <w:t xml:space="preserve">0 bis 1</w:t>
+            </w:r>
+          </w:p>
+        </w:tc>
+        <w:tc>
+          <w:tcPr/>
+          <w:p>
+            <w:pPr>
+              <w:pStyle w:val="Compact"/>
+            </w:pPr>
+            <w:r>
+              <w:t xml:space="preserve">0 = keine Reflexion, 1 = vollständige Reflexion</w:t>
+            </w:r>
+          </w:p>
+        </w:tc>
+      </w:tr>
+      <w:tr>
+        <w:tc>
+          <w:tcPr/>
+          <w:p>
+            <w:pPr>
+              <w:pStyle w:val="Compact"/>
+            </w:pPr>
+            <w:r>
+              <w:t xml:space="preserve">Emissivität</w:t>
+            </w:r>
+          </w:p>
+        </w:tc>
+        <w:tc>
+          <w:tcPr/>
+          <w:p>
+            <w:pPr>
+              <w:pStyle w:val="Compact"/>
+            </w:pPr>
+            <w:r>
+              <w:t xml:space="preserve">0 bis 1</w:t>
+            </w:r>
+          </w:p>
+        </w:tc>
+        <w:tc>
+          <w:tcPr/>
+          <w:p>
+            <w:pPr>
+              <w:pStyle w:val="Compact"/>
+            </w:pPr>
+            <w:r>
+              <w:t xml:space="preserve">1 = sehr gute langwellige Abstrahlung</w:t>
+            </w:r>
+          </w:p>
+        </w:tc>
+      </w:tr>
+      <w:tr>
+        <w:tc>
+          <w:tcPr/>
+          <w:p>
+            <w:pPr>
+              <w:pStyle w:val="Compact"/>
+            </w:pPr>
+            <w:r>
+              <w:t xml:space="preserve">Schattenlevel</w:t>
+            </w:r>
+          </w:p>
+        </w:tc>
+        <w:tc>
+          <w:tcPr/>
+          <w:p>
+            <w:pPr>
+              <w:pStyle w:val="Compact"/>
+            </w:pPr>
+            <w:r>
+              <w:t xml:space="preserve">0 bis 1</w:t>
+            </w:r>
+          </w:p>
+        </w:tc>
+        <w:tc>
+          <w:tcPr/>
+          <w:p>
+            <w:pPr>
+              <w:pStyle w:val="Compact"/>
+            </w:pPr>
+            <w:r>
+              <w:t xml:space="preserve">0 = kein Schatten, 1 = sehr starke Verschattung</w:t>
+            </w:r>
+          </w:p>
+        </w:tc>
+      </w:tr>
+      <w:tr>
+        <w:tc>
+          <w:tcPr/>
+          <w:p>
+            <w:pPr>
+              <w:pStyle w:val="Compact"/>
+            </w:pPr>
+            <w:r>
+              <w:t xml:space="preserve">Vegetationseinfluss</w:t>
+            </w:r>
+          </w:p>
+        </w:tc>
+        <w:tc>
+          <w:tcPr/>
+          <w:p>
+            <w:pPr>
+              <w:pStyle w:val="Compact"/>
+            </w:pPr>
+            <w:r>
+              <w:t xml:space="preserve">0 bis 1</w:t>
+            </w:r>
+          </w:p>
+        </w:tc>
+        <w:tc>
+          <w:tcPr/>
+          <w:p>
+            <w:pPr>
+              <w:pStyle w:val="Compact"/>
+            </w:pPr>
+            <w:r>
+              <w:t xml:space="preserve">0 = kein Einfluss, 1 = starker Einfluss</w:t>
+            </w:r>
+          </w:p>
+        </w:tc>
+      </w:tr>
+      <w:tr>
+        <w:tc>
+          <w:tcPr/>
+          <w:p>
+            <w:pPr>
+              <w:pStyle w:val="Compact"/>
+            </w:pPr>
+            <w:r>
+              <w:t xml:space="preserve">Einfassung</w:t>
+            </w:r>
+          </w:p>
+        </w:tc>
+        <w:tc>
+          <w:tcPr/>
+          <w:p>
+            <w:pPr>
+              <w:pStyle w:val="Compact"/>
+            </w:pPr>
+            <w:r>
+              <w:t xml:space="preserve">0 bis 1</w:t>
+            </w:r>
+          </w:p>
+        </w:tc>
+        <w:tc>
+          <w:tcPr/>
+          <w:p>
+            <w:pPr>
+              <w:pStyle w:val="Compact"/>
+            </w:pPr>
+            <w:r>
+              <w:t xml:space="preserve">0 = offen, 1 = stark eingefasst</w:t>
+            </w:r>
+          </w:p>
+        </w:tc>
+      </w:tr>
+      <w:tr>
+        <w:tc>
+          <w:tcPr/>
+          <w:p>
+            <w:pPr>
+              <w:pStyle w:val="Compact"/>
+            </w:pPr>
+            <w:r>
+              <w:t xml:space="preserve">Hitzelastklasse</w:t>
+            </w:r>
+          </w:p>
+        </w:tc>
+        <w:tc>
+          <w:tcPr/>
+          <w:p>
+            <w:pPr>
+              <w:pStyle w:val="Compact"/>
+            </w:pPr>
+            <w:r>
+              <w:t xml:space="preserve">1 bis 5</w:t>
+            </w:r>
+          </w:p>
+        </w:tc>
+        <w:tc>
+          <w:tcPr/>
+          <w:p>
+            <w:pPr>
+              <w:pStyle w:val="Compact"/>
+            </w:pPr>
+            <w:r>
+              <w:t xml:space="preserve">blau bis rot, geringe bis starke Belastung</w:t>
+            </w:r>
+          </w:p>
+        </w:tc>
+      </w:tr>
+    </w:tbl>
+    <w:bookmarkEnd w:id="29"/>
+    <w:bookmarkStart w:id="30" w:name="wie-die-formeln-zu-lesen-sind"/>
+    <w:p>
+      <w:pPr>
+        <w:pStyle w:val="Heading1"/>
+      </w:pPr>
+      <w:r>
+        <w:t xml:space="preserve">Wie die Formeln zu lesen sind</w:t>
+      </w:r>
+    </w:p>
+    <w:p>
+      <w:pPr>
+        <w:pStyle w:val="FirstParagraph"/>
+      </w:pPr>
+      <w:r>
+        <w:t xml:space="preserve">Die Formeln in dieser Dokumentation sollen die Modelllogik transparent machen. Sie sind nicht als vollständige mikrometeorologische Theorie zu lesen. Viele Terme sind bewusst einfach gehalten.</w:t>
+      </w:r>
+    </w:p>
+    <w:p>
+      <w:pPr>
+        <w:pStyle w:val="BodyText"/>
+      </w:pPr>
+      <w:r>
+        <w:t xml:space="preserve">Ein Beispiel:</w:t>
+      </w:r>
+    </w:p>
+    <w:p>
+      <w:pPr>
+        <w:pStyle w:val="BodyText"/>
+      </w:pPr>
+      <w:r>
+        <w:t xml:space="preserve">Die Oberflächenenergiebilanz lautet im Modell vereinfacht:</w:t>
+      </w:r>
+    </w:p>
+    <w:p>
+      <w:pPr>
+        <w:pStyle w:val="BodyText"/>
+      </w:pPr>
+      <m:oMathPara>
+        <m:oMathParaPr>
+          <m:jc m:val="center"/>
+        </m:oMathParaPr>
+        <m:oMath>
+          <m:sSub>
+            <m:e>
+              <m:r>
+                <m:t>Q</m:t>
+              </m:r>
+            </m:e>
+            <m:sub>
+              <m:r>
+                <m:rPr>
+                  <m:sty m:val="p"/>
+                </m:rPr>
+                <m:t>n</m:t>
+              </m:r>
+              <m:r>
+                <m:rPr>
+                  <m:sty m:val="p"/>
+                </m:rPr>
+                <m:t>e</m:t>
+              </m:r>
+              <m:r>
+                <m:rPr>
+                  <m:sty m:val="p"/>
+                </m:rPr>
+                <m:t>t</m:t>
+              </m:r>
+            </m:sub>
+          </m:sSub>
+          <m:r>
+            <m:rPr>
+              <m:sty m:val="p"/>
+            </m:rPr>
+            <m:t>=</m:t>
+          </m:r>
+          <m:sSub>
+            <m:e>
+              <m:r>
+                <m:t>Q</m:t>
+              </m:r>
+            </m:e>
+            <m:sub>
+              <m:r>
+                <m:rPr>
+                  <m:sty m:val="p"/>
+                </m:rPr>
+                <m:t>S</m:t>
+              </m:r>
+              <m:r>
+                <m:rPr>
+                  <m:sty m:val="p"/>
+                </m:rPr>
+                <m:t>W</m:t>
+              </m:r>
+            </m:sub>
+          </m:sSub>
+          <m:r>
+            <m:rPr>
+              <m:sty m:val="p"/>
+            </m:rPr>
+            <m:t>+</m:t>
+          </m:r>
+          <m:sSub>
+            <m:e>
+              <m:r>
+                <m:t>Q</m:t>
+              </m:r>
+            </m:e>
+            <m:sub>
+              <m:r>
+                <m:rPr>
+                  <m:sty m:val="p"/>
+                </m:rPr>
+                <m:t>w</m:t>
+              </m:r>
+              <m:r>
+                <m:rPr>
+                  <m:sty m:val="p"/>
+                </m:rPr>
+                <m:t>a</m:t>
+              </m:r>
+              <m:r>
+                <m:rPr>
+                  <m:sty m:val="p"/>
+                </m:rPr>
+                <m:t>l</m:t>
+              </m:r>
+              <m:r>
+                <m:rPr>
+                  <m:sty m:val="p"/>
+                </m:rPr>
+                <m:t>l</m:t>
+              </m:r>
+            </m:sub>
+          </m:sSub>
+          <m:r>
+            <m:rPr>
+              <m:sty m:val="p"/>
+            </m:rPr>
+            <m:t>+</m:t>
+          </m:r>
+          <m:sSub>
+            <m:e>
+              <m:r>
+                <m:t>Q</m:t>
+              </m:r>
+            </m:e>
+            <m:sub>
+              <m:r>
+                <m:rPr>
+                  <m:sty m:val="p"/>
+                </m:rPr>
+                <m:t>L</m:t>
+              </m:r>
+              <m:r>
+                <m:rPr>
+                  <m:sty m:val="p"/>
+                </m:rPr>
+                <m:t>W</m:t>
+              </m:r>
+            </m:sub>
+          </m:sSub>
+          <m:r>
+            <m:rPr>
+              <m:sty m:val="p"/>
+            </m:rPr>
+            <m:t>−</m:t>
+          </m:r>
+          <m:sSub>
+            <m:e>
+              <m:r>
+                <m:t>Q</m:t>
+              </m:r>
+            </m:e>
+            <m:sub>
+              <m:r>
+                <m:t>H</m:t>
+              </m:r>
+            </m:sub>
+          </m:sSub>
+          <m:r>
+            <m:rPr>
+              <m:sty m:val="p"/>
+            </m:rPr>
+            <m:t>−</m:t>
+          </m:r>
+          <m:sSub>
+            <m:e>
+              <m:r>
+                <m:t>Q</m:t>
+              </m:r>
+            </m:e>
+            <m:sub>
+              <m:r>
+                <m:t>L</m:t>
+              </m:r>
+              <m:r>
+                <m:t>E</m:t>
+              </m:r>
+            </m:sub>
+          </m:sSub>
+          <m:r>
+            <m:rPr>
+              <m:sty m:val="p"/>
+            </m:rPr>
+            <m:t>−</m:t>
+          </m:r>
+          <m:sSub>
+            <m:e>
+              <m:r>
+                <m:t>Q</m:t>
+              </m:r>
+            </m:e>
+            <m:sub>
+              <m:r>
+                <m:t>G</m:t>
+              </m:r>
+            </m:sub>
+          </m:sSub>
+        </m:oMath>
+      </m:oMathPara>
+    </w:p>
+    <w:p>
+      <w:pPr>
+        <w:pStyle w:val="FirstParagraph"/>
+      </w:pPr>
+      <w:r>
+        <w:t xml:space="preserve">Das bedeutet in Worten:</w:t>
+      </w:r>
+    </w:p>
+    <w:p>
+      <w:pPr>
+        <w:pStyle w:val="BlockText"/>
+      </w:pPr>
+      <w:r>
+        <w:t xml:space="preserve">Die Oberfläche wird durch Sonne, Wände und langwellige Strahlung erwärmt oder abgekühlt. Gleichzeitig verliert sie Energie an die Luft, durch Verdunstung und an den Untergrund.</w:t>
+      </w:r>
+    </w:p>
+    <w:p>
+      <w:pPr>
+        <w:pStyle w:val="FirstParagraph"/>
+      </w:pPr>
+      <w:r>
+        <w:t xml:space="preserve">Die Formel ist also kein Selbstzweck. Sie zeigt, welche Prozessgruppen im Modell getrennt berücksichtigt werden.</w:t>
+      </w:r>
+    </w:p>
+    <w:bookmarkEnd w:id="30"/>
+    <w:bookmarkStart w:id="31" w:name="Xcf63ae2b29e6d5cd90fb75705a475c9a7d3e2d7"/>
+    <w:p>
+      <w:pPr>
+        <w:pStyle w:val="Heading1"/>
+      </w:pPr>
+      <w:r>
+        <w:t xml:space="preserve">Was Lehrkräfte aus dem Modell ableiten können</w:t>
+      </w:r>
+    </w:p>
+    <w:p>
+      <w:pPr>
+        <w:pStyle w:val="FirstParagraph"/>
+      </w:pPr>
+      <w:r>
+        <w:t xml:space="preserve">Das Modell erlaubt folgende fachlich sinnvolle Aussagen:</w:t>
+      </w:r>
+    </w:p>
+    <w:p>
+      <w:pPr>
+        <w:pStyle w:val="Compact"/>
+        <w:numPr>
+          <w:ilvl w:val="0"/>
+          <w:numId w:val="1003"/>
+        </w:numPr>
+      </w:pPr>
+      <w:r>
+        <w:t xml:space="preserve">Welche Flächen werden im Modell besonders stark belastet?</w:t>
+      </w:r>
+    </w:p>
+    <w:p>
+      <w:pPr>
+        <w:pStyle w:val="Compact"/>
+        <w:numPr>
+          <w:ilvl w:val="0"/>
+          <w:numId w:val="1003"/>
+        </w:numPr>
+      </w:pPr>
+      <w:r>
+        <w:t xml:space="preserve">Welche Rolle spielen Schatten, Material und Vegetation?</w:t>
+      </w:r>
+    </w:p>
+    <w:p>
+      <w:pPr>
+        <w:pStyle w:val="Compact"/>
+        <w:numPr>
+          <w:ilvl w:val="0"/>
+          <w:numId w:val="1003"/>
+        </w:numPr>
+      </w:pPr>
+      <w:r>
+        <w:t xml:space="preserve">Wo wirken Maßnahmen lokal und wo flächig?</w:t>
+      </w:r>
+    </w:p>
+    <w:p>
+      <w:pPr>
+        <w:pStyle w:val="Compact"/>
+        <w:numPr>
+          <w:ilvl w:val="0"/>
+          <w:numId w:val="1003"/>
+        </w:numPr>
+      </w:pPr>
+      <w:r>
+        <w:t xml:space="preserve">Welche Maßnahme verbessert die Hitzelast auf Aufenthaltsflächen stärker?</w:t>
+      </w:r>
+    </w:p>
+    <w:p>
+      <w:pPr>
+        <w:pStyle w:val="Compact"/>
+        <w:numPr>
+          <w:ilvl w:val="0"/>
+          <w:numId w:val="1003"/>
+        </w:numPr>
+      </w:pPr>
+      <w:r>
+        <w:t xml:space="preserve">Warum kann eine Maßnahme an einer Stelle sinnvoll sein, an einer anderen aber wenig bringen?</w:t>
+      </w:r>
+    </w:p>
+    <w:p>
+      <w:pPr>
+        <w:pStyle w:val="Compact"/>
+        <w:numPr>
+          <w:ilvl w:val="0"/>
+          <w:numId w:val="1003"/>
+        </w:numPr>
+      </w:pPr>
+      <w:r>
+        <w:t xml:space="preserve">Warum reicht es nicht, einfach „mehr Grün“ zu fordern, sondern warum Lage, Schatten, Nutzung und Material zusammen betrachtet werden müssen?</w:t>
+      </w:r>
+    </w:p>
+    <w:p>
+      <w:pPr>
+        <w:pStyle w:val="FirstParagraph"/>
+      </w:pPr>
+      <w:r>
+        <w:t xml:space="preserve">Das Modell erlaubt nicht:</w:t>
+      </w:r>
+    </w:p>
+    <w:p>
+      <w:pPr>
+        <w:pStyle w:val="Compact"/>
+        <w:numPr>
+          <w:ilvl w:val="0"/>
+          <w:numId w:val="1004"/>
+        </w:numPr>
+      </w:pPr>
+      <w:r>
+        <w:t xml:space="preserve">eine exakte Temperaturprognose für einen realen Schulhof,</w:t>
+      </w:r>
+    </w:p>
+    <w:p>
+      <w:pPr>
+        <w:pStyle w:val="Compact"/>
+        <w:numPr>
+          <w:ilvl w:val="0"/>
+          <w:numId w:val="1004"/>
+        </w:numPr>
+      </w:pPr>
+      <w:r>
+        <w:t xml:space="preserve">eine belastbare Bauplanungsentscheidung ohne weitere Fachanalyse,</w:t>
+      </w:r>
+    </w:p>
+    <w:p>
+      <w:pPr>
+        <w:pStyle w:val="Compact"/>
+        <w:numPr>
+          <w:ilvl w:val="0"/>
+          <w:numId w:val="1004"/>
+        </w:numPr>
+      </w:pPr>
+      <w:r>
+        <w:t xml:space="preserve">eine medizinische Bewertung von Hitzestress,</w:t>
+      </w:r>
+    </w:p>
+    <w:p>
+      <w:pPr>
+        <w:pStyle w:val="Compact"/>
+        <w:numPr>
+          <w:ilvl w:val="0"/>
+          <w:numId w:val="1004"/>
+        </w:numPr>
+      </w:pPr>
+      <w:r>
+        <w:t xml:space="preserve">eine exakte Aussage über reale Grad-Celsius-Effekte einzelner Maßnahmen.</w:t>
+      </w:r>
+    </w:p>
+    <w:bookmarkEnd w:id="31"/>
+    <w:bookmarkStart w:id="35" w:name="grundstruktur"/>
+    <w:p>
+      <w:pPr>
+        <w:pStyle w:val="Heading1"/>
+      </w:pPr>
+      <w:r>
         <w:t xml:space="preserve">Grundstruktur</w:t>
       </w:r>
     </w:p>
-    <w:bookmarkStart w:id="21" w:name="raum"/>
+    <w:bookmarkStart w:id="32" w:name="raum"/>
     <w:p>
       <w:pPr>
         <w:pStyle w:val="Heading2"/>
@@ -361,8 +2979,8 @@
         <w:t xml:space="preserve">Jeder Patch repräsentiert eine kleine Fläche des Schulhofs. Die tatsächliche reale Kantenlänge eines Patches wird nicht als feste metrische Größe erzwungen. Für die didaktische Interpretation kann ein Patch als Rasterzelle eines vereinfachten Lageplans gelesen werden.</w:t>
       </w:r>
     </w:p>
-    <w:bookmarkEnd w:id="21"/>
-    <w:bookmarkStart w:id="22" w:name="zeit"/>
+    <w:bookmarkEnd w:id="32"/>
+    <w:bookmarkStart w:id="33" w:name="zeit"/>
     <w:p>
       <w:pPr>
         <w:pStyle w:val="Heading2"/>
@@ -526,8 +3144,8 @@
         <w:t xml:space="preserve">Der interne Zeitschritt von 0.25 h entspricht 15 Minuten. Viele Ausgaben und Protokolle werden nur zu vollen Stunden aktualisiert, die thermische Dynamik wird aber in 15-Minuten-Schritten berechnet.</w:t>
       </w:r>
     </w:p>
-    <w:bookmarkEnd w:id="22"/>
-    <w:bookmarkStart w:id="23" w:name="zustandslogik"/>
+    <w:bookmarkEnd w:id="33"/>
+    <w:bookmarkStart w:id="34" w:name="zustandslogik"/>
     <w:p>
       <w:pPr>
         <w:pStyle w:val="Heading2"/>
@@ -549,7 +3167,7 @@
         <w:pStyle w:val="Compact"/>
         <w:numPr>
           <w:ilvl w:val="0"/>
-          <w:numId w:val="1002"/>
+          <w:numId w:val="1005"/>
         </w:numPr>
       </w:pPr>
       <w:r>
@@ -568,7 +3186,7 @@
         <w:pStyle w:val="Compact"/>
         <w:numPr>
           <w:ilvl w:val="0"/>
-          <w:numId w:val="1002"/>
+          <w:numId w:val="1005"/>
         </w:numPr>
       </w:pPr>
       <w:r>
@@ -587,7 +3205,7 @@
         <w:pStyle w:val="Compact"/>
         <w:numPr>
           <w:ilvl w:val="0"/>
-          <w:numId w:val="1002"/>
+          <w:numId w:val="1005"/>
         </w:numPr>
       </w:pPr>
       <w:r>
@@ -609,9 +3227,9 @@
         <w:t xml:space="preserve">Diese Trennung ist didaktisch wichtig. Heiße Oberflächen und warme Luft sind nicht identisch. Asphalt kann deutlich heißer werden als die Luft darüber. Die Luft reagiert verzögert und wird zusätzlich durch Mischung, Wind, Vegetation und Fassaden beeinflusst.</w:t>
       </w:r>
     </w:p>
-    <w:bookmarkEnd w:id="23"/>
-    <w:bookmarkEnd w:id="24"/>
-    <w:bookmarkStart w:id="27" w:name="patch-semantik"/>
+    <w:bookmarkEnd w:id="34"/>
+    <w:bookmarkEnd w:id="35"/>
+    <w:bookmarkStart w:id="38" w:name="patch-semantik"/>
     <w:p>
       <w:pPr>
         <w:pStyle w:val="Heading1"/>
@@ -782,7 +3400,7 @@
         <w:t xml:space="preserve">Diese Trennung verhindert, dass ein Baum einfach als grüner Boden behandelt wird. Ein Baum ist ein Objekt mit Schattenwurf, Vegetationshöhe und Verdunstung. Ein Gebäude ist ein Objekt mit Dach, Wand, Höhe, Schatten und Fassadenwirkung.</w:t>
       </w:r>
     </w:p>
-    <w:bookmarkStart w:id="25" w:name="bodenklassen"/>
+    <w:bookmarkStart w:id="36" w:name="bodenklassen"/>
     <w:p>
       <w:pPr>
         <w:pStyle w:val="Heading2"/>
@@ -804,7 +3422,7 @@
         <w:pStyle w:val="Compact"/>
         <w:numPr>
           <w:ilvl w:val="0"/>
-          <w:numId w:val="1003"/>
+          <w:numId w:val="1006"/>
         </w:numPr>
       </w:pPr>
       <w:r>
@@ -819,7 +3437,7 @@
         <w:pStyle w:val="Compact"/>
         <w:numPr>
           <w:ilvl w:val="0"/>
-          <w:numId w:val="1003"/>
+          <w:numId w:val="1006"/>
         </w:numPr>
       </w:pPr>
       <w:r>
@@ -834,7 +3452,7 @@
         <w:pStyle w:val="Compact"/>
         <w:numPr>
           <w:ilvl w:val="0"/>
-          <w:numId w:val="1003"/>
+          <w:numId w:val="1006"/>
         </w:numPr>
       </w:pPr>
       <w:r>
@@ -849,7 +3467,7 @@
         <w:pStyle w:val="Compact"/>
         <w:numPr>
           <w:ilvl w:val="0"/>
-          <w:numId w:val="1003"/>
+          <w:numId w:val="1006"/>
         </w:numPr>
       </w:pPr>
       <w:r>
@@ -864,7 +3482,7 @@
         <w:pStyle w:val="Compact"/>
         <w:numPr>
           <w:ilvl w:val="0"/>
-          <w:numId w:val="1003"/>
+          <w:numId w:val="1006"/>
         </w:numPr>
       </w:pPr>
       <w:r>
@@ -879,7 +3497,7 @@
         <w:pStyle w:val="Compact"/>
         <w:numPr>
           <w:ilvl w:val="0"/>
-          <w:numId w:val="1003"/>
+          <w:numId w:val="1006"/>
         </w:numPr>
       </w:pPr>
       <w:r>
@@ -894,7 +3512,7 @@
         <w:pStyle w:val="Compact"/>
         <w:numPr>
           <w:ilvl w:val="0"/>
-          <w:numId w:val="1003"/>
+          <w:numId w:val="1006"/>
         </w:numPr>
       </w:pPr>
       <w:r>
@@ -921,8 +3539,8 @@
         <w:t xml:space="preserve">wird für Gebäudepatches verwendet, weil dort keine begehbare Bodenfläche modelliert wird.</w:t>
       </w:r>
     </w:p>
-    <w:bookmarkEnd w:id="25"/>
-    <w:bookmarkStart w:id="26" w:name="objektklassen"/>
+    <w:bookmarkEnd w:id="36"/>
+    <w:bookmarkStart w:id="37" w:name="objektklassen"/>
     <w:p>
       <w:pPr>
         <w:pStyle w:val="Heading2"/>
@@ -944,7 +3562,7 @@
         <w:pStyle w:val="Compact"/>
         <w:numPr>
           <w:ilvl w:val="0"/>
-          <w:numId w:val="1004"/>
+          <w:numId w:val="1007"/>
         </w:numPr>
       </w:pPr>
       <w:r>
@@ -959,7 +3577,7 @@
         <w:pStyle w:val="Compact"/>
         <w:numPr>
           <w:ilvl w:val="0"/>
-          <w:numId w:val="1004"/>
+          <w:numId w:val="1007"/>
         </w:numPr>
       </w:pPr>
       <w:r>
@@ -974,7 +3592,7 @@
         <w:pStyle w:val="Compact"/>
         <w:numPr>
           <w:ilvl w:val="0"/>
-          <w:numId w:val="1004"/>
+          <w:numId w:val="1007"/>
         </w:numPr>
       </w:pPr>
       <w:r>
@@ -989,7 +3607,7 @@
         <w:pStyle w:val="Compact"/>
         <w:numPr>
           <w:ilvl w:val="0"/>
-          <w:numId w:val="1004"/>
+          <w:numId w:val="1007"/>
         </w:numPr>
       </w:pPr>
       <w:r>
@@ -1007,9 +3625,9 @@
         <w:t xml:space="preserve">Gebäude besitzen eine Höhe, einen Dachstil und einen Wandstil. Bäume und Hecken besitzen eine Vegetationshöhe und werfen Schatten.</w:t>
       </w:r>
     </w:p>
-    <w:bookmarkEnd w:id="26"/>
-    <w:bookmarkEnd w:id="27"/>
-    <w:bookmarkStart w:id="31" w:name="materialparameter"/>
+    <w:bookmarkEnd w:id="37"/>
+    <w:bookmarkEnd w:id="38"/>
+    <w:bookmarkStart w:id="42" w:name="materialparameter"/>
     <w:p>
       <w:pPr>
         <w:pStyle w:val="Heading1"/>
@@ -1234,7 +3852,7 @@
         </w:tc>
       </w:tr>
     </w:tbl>
-    <w:bookmarkStart w:id="28" w:name="bodenflächen"/>
+    <w:bookmarkStart w:id="39" w:name="bodenflächen"/>
     <w:p>
       <w:pPr>
         <w:pStyle w:val="Heading2"/>
@@ -1757,8 +4375,8 @@
         <w:t xml:space="preserve">Die Werte sind effektive Modellparameter. Asphalt ist dunkel und ohne Verdunstung. Pflaster ist heller als Asphalt, aber ebenfalls trocken. Offenpflaster erhält einen kleinen Verdunstungsanteil. Rasen erhält eine starke Verdunstungsfähigkeit, bleibt aber wasserlimitiert.</w:t>
       </w:r>
     </w:p>
-    <w:bookmarkEnd w:id="28"/>
-    <w:bookmarkStart w:id="29" w:name="dächer"/>
+    <w:bookmarkEnd w:id="39"/>
+    <w:bookmarkStart w:id="40" w:name="dächer"/>
     <w:p>
       <w:pPr>
         <w:pStyle w:val="Heading2"/>
@@ -1976,8 +4594,8 @@
         <w:t xml:space="preserve">Das normale Dach wird als dunkles Bitumendach behandelt. Das Gründach wird als extensives Gründach modelliert: kühler als Bitumen, aber flacher, trockener und weniger leistungsfähig als bodengebundener Rasen.</w:t>
       </w:r>
     </w:p>
-    <w:bookmarkEnd w:id="29"/>
-    <w:bookmarkStart w:id="30" w:name="vegetation"/>
+    <w:bookmarkEnd w:id="40"/>
+    <w:bookmarkStart w:id="41" w:name="vegetation"/>
     <w:p>
       <w:pPr>
         <w:pStyle w:val="Heading2"/>
@@ -2195,9 +4813,9 @@
         <w:t xml:space="preserve">Bäume und Hecken wirken nicht nur über Materialparameter. Sie wirken zusätzlich über Schattenwurf, Vegetationsnähe, Wasserhaushalt und geringere direkte Strahlungsbelastung.</w:t>
       </w:r>
     </w:p>
-    <w:bookmarkEnd w:id="30"/>
-    <w:bookmarkEnd w:id="31"/>
-    <w:bookmarkStart w:id="34" w:name="wasserhaushalt"/>
+    <w:bookmarkEnd w:id="41"/>
+    <w:bookmarkEnd w:id="42"/>
+    <w:bookmarkStart w:id="45" w:name="wasserhaushalt"/>
     <w:p>
       <w:pPr>
         <w:pStyle w:val="Heading1"/>
@@ -2356,7 +4974,7 @@
         <w:t xml:space="preserve">Die Anfangsfüllung wird als Anteil der maximalen Speicherkapazität gesetzt.</w:t>
       </w:r>
     </w:p>
-    <w:bookmarkStart w:id="32" w:name="wasserspeicherparameter"/>
+    <w:bookmarkStart w:id="43" w:name="wasserspeicherparameter"/>
     <w:p>
       <w:pPr>
         <w:pStyle w:val="Heading2"/>
@@ -2928,8 +5546,8 @@
         <w:t xml:space="preserve">Die Speicherwerte sind didaktische Effektivwerte. Sie steuern, ob ein Patch Verdunstung liefern kann. Trockene, versiegelte Materialien erhalten praktisch keinen wirksamen Speicher.</w:t>
       </w:r>
     </w:p>
-    <w:bookmarkEnd w:id="32"/>
-    <w:bookmarkStart w:id="33" w:name="nachlieferung-aus-tieferem-boden"/>
+    <w:bookmarkEnd w:id="43"/>
+    <w:bookmarkStart w:id="44" w:name="nachlieferung-aus-tieferem-boden"/>
     <w:p>
       <w:pPr>
         <w:pStyle w:val="Heading2"/>
@@ -3068,9 +5686,9 @@
         <w:t xml:space="preserve">Die Nachlieferung wird zusätzlich mit dem freien Speicherraum skaliert. Ist der Speicher voll, wird nichts nachgefüllt. Ist er leer, ist die Nachlieferung maximal.</w:t>
       </w:r>
     </w:p>
-    <w:bookmarkEnd w:id="33"/>
-    <w:bookmarkEnd w:id="34"/>
-    <w:bookmarkStart w:id="41" w:name="meteorologischer-antrieb"/>
+    <w:bookmarkEnd w:id="44"/>
+    <w:bookmarkEnd w:id="45"/>
+    <w:bookmarkStart w:id="52" w:name="meteorologischer-antrieb"/>
     <w:p>
       <w:pPr>
         <w:pStyle w:val="Heading1"/>
@@ -3102,7 +5720,7 @@
         <w:t xml:space="preserve">erzeugt. Das Modell nutzt drei Jahreszeiten: Sommer, Frühling/Herbst und Winter.</w:t>
       </w:r>
     </w:p>
-    <w:bookmarkStart w:id="35" w:name="jahreszeitliche-parameter"/>
+    <w:bookmarkStart w:id="46" w:name="jahreszeitliche-parameter"/>
     <w:p>
       <w:pPr>
         <w:pStyle w:val="Heading2"/>
@@ -3520,8 +6138,8 @@
         </w:tc>
       </w:tr>
     </w:tbl>
-    <w:bookmarkEnd w:id="35"/>
-    <w:bookmarkStart w:id="36" w:name="sonnenaufgang-und-sonnenuntergang"/>
+    <w:bookmarkEnd w:id="46"/>
+    <w:bookmarkStart w:id="47" w:name="sonnenaufgang-und-sonnenuntergang"/>
     <w:p>
       <w:pPr>
         <w:pStyle w:val="Heading2"/>
@@ -3780,8 +6398,8 @@
         <w:t xml:space="preserve">Außerhalb dieses Zeitraums ist der solare Antrieb null.</w:t>
       </w:r>
     </w:p>
-    <w:bookmarkEnd w:id="36"/>
-    <w:bookmarkStart w:id="37" w:name="sonnenfaktor"/>
+    <w:bookmarkEnd w:id="47"/>
+    <w:bookmarkStart w:id="48" w:name="sonnenfaktor"/>
     <w:p>
       <w:pPr>
         <w:pStyle w:val="Heading2"/>
@@ -4020,8 +6638,8 @@
         <w:t xml:space="preserve">In NetLogo werden trigonometrische Funktionen mit Gradwerten verwendet. Der Sonnenfaktor ist eine dimensionslose Größe zwischen 0 und 1.</w:t>
       </w:r>
     </w:p>
-    <w:bookmarkEnd w:id="37"/>
-    <w:bookmarkStart w:id="38" w:name="sonnenhöhe-und-azimut"/>
+    <w:bookmarkEnd w:id="48"/>
+    <w:bookmarkStart w:id="49" w:name="sonnenhöhe-und-azimut"/>
     <w:p>
       <w:pPr>
         <w:pStyle w:val="Heading2"/>
@@ -4177,8 +6795,8 @@
         <w:t xml:space="preserve">Das ist keine astronomisch exakte Sonnenstandsberechnung, sondern eine vereinfachte didaktische Tagesbahn.</w:t>
       </w:r>
     </w:p>
-    <w:bookmarkEnd w:id="38"/>
-    <w:bookmarkStart w:id="39" w:name="hintergrundlufttemperatur"/>
+    <w:bookmarkEnd w:id="49"/>
+    <w:bookmarkStart w:id="50" w:name="hintergrundlufttemperatur"/>
     <w:p>
       <w:pPr>
         <w:pStyle w:val="Heading2"/>
@@ -4493,8 +7111,8 @@
         <w:t xml:space="preserve">Der zweite Cosinus-Term verhindert einen vollständig symmetrischen Tagesgang. Dadurch fällt die Temperatur am Nachmittag und Abend nicht exakt spiegelbildlich zum Vormittag.</w:t>
       </w:r>
     </w:p>
-    <w:bookmarkEnd w:id="39"/>
-    <w:bookmarkStart w:id="40" w:name="relative-luftfeuchte"/>
+    <w:bookmarkEnd w:id="50"/>
+    <w:bookmarkStart w:id="51" w:name="relative-luftfeuchte"/>
     <w:p>
       <w:pPr>
         <w:pStyle w:val="Heading2"/>
@@ -4889,9 +7507,9 @@
         </m:oMath>
       </m:oMathPara>
     </w:p>
-    <w:bookmarkEnd w:id="40"/>
-    <w:bookmarkEnd w:id="41"/>
-    <w:bookmarkStart w:id="46" w:name="abgeleitete-räumliche-felder"/>
+    <w:bookmarkEnd w:id="51"/>
+    <w:bookmarkEnd w:id="52"/>
+    <w:bookmarkStart w:id="57" w:name="abgeleitete-räumliche-felder"/>
     <w:p>
       <w:pPr>
         <w:pStyle w:val="Heading1"/>
@@ -4913,7 +7531,7 @@
         <w:pStyle w:val="Compact"/>
         <w:numPr>
           <w:ilvl w:val="0"/>
-          <w:numId w:val="1005"/>
+          <w:numId w:val="1008"/>
         </w:numPr>
       </w:pPr>
       <w:r>
@@ -4925,7 +7543,7 @@
         <w:pStyle w:val="Compact"/>
         <w:numPr>
           <w:ilvl w:val="0"/>
-          <w:numId w:val="1005"/>
+          <w:numId w:val="1008"/>
         </w:numPr>
       </w:pPr>
       <w:r>
@@ -4937,7 +7555,7 @@
         <w:pStyle w:val="Compact"/>
         <w:numPr>
           <w:ilvl w:val="0"/>
-          <w:numId w:val="1005"/>
+          <w:numId w:val="1008"/>
         </w:numPr>
       </w:pPr>
       <w:r>
@@ -4952,7 +7570,7 @@
         <w:t xml:space="preserve">Diese Felder werden nicht direkt eingezeichnet, beeinflussen aber Temperatur, Hitzelast und Luftaustausch.</w:t>
       </w:r>
     </w:p>
-    <w:bookmarkStart w:id="42" w:name="vegetationseinfluss"/>
+    <w:bookmarkStart w:id="53" w:name="vegetationseinfluss"/>
     <w:p>
       <w:pPr>
         <w:pStyle w:val="Heading2"/>
@@ -5506,8 +8124,8 @@
         <w:t xml:space="preserve">Vegetation wirkt dadurch nicht nur auf dem Patch selbst, sondern auch in der Umgebung. Bäume werden stärker gewichtet als Hecken.</w:t>
       </w:r>
     </w:p>
-    <w:bookmarkEnd w:id="42"/>
-    <w:bookmarkStart w:id="43" w:name="wandkontext"/>
+    <w:bookmarkEnd w:id="53"/>
+    <w:bookmarkStart w:id="54" w:name="wandkontext"/>
     <w:p>
       <w:pPr>
         <w:pStyle w:val="Heading2"/>
@@ -5961,8 +8579,8 @@
         </m:oMath>
       </m:oMathPara>
     </w:p>
-    <w:bookmarkEnd w:id="43"/>
-    <w:bookmarkStart w:id="44" w:name="wand-albedo-und-wandbegrünung"/>
+    <w:bookmarkEnd w:id="54"/>
+    <w:bookmarkStart w:id="55" w:name="wand-albedo-und-wandbegrünung"/>
     <w:p>
       <w:pPr>
         <w:pStyle w:val="Heading2"/>
@@ -6113,8 +8731,8 @@
         <w:t xml:space="preserve">Die grüne Wand reduziert Wandwärmelasten und erzeugt zusätzlich eine aktive evapotranspirative Entlastung.</w:t>
       </w:r>
     </w:p>
-    <w:bookmarkEnd w:id="44"/>
-    <w:bookmarkStart w:id="45" w:name="einfassung"/>
+    <w:bookmarkEnd w:id="55"/>
+    <w:bookmarkStart w:id="56" w:name="einfassung"/>
     <w:p>
       <w:pPr>
         <w:pStyle w:val="Heading2"/>
@@ -6386,9 +9004,9 @@
         <w:t xml:space="preserve">Einfassung reduziert Luftaustausch und Windentlastung. Hecken zählen nur abgeschwächt, weil sie weniger massiv wirken als Gebäude.</w:t>
       </w:r>
     </w:p>
-    <w:bookmarkEnd w:id="45"/>
-    <w:bookmarkEnd w:id="46"/>
-    <w:bookmarkStart w:id="49" w:name="schattenmodell"/>
+    <w:bookmarkEnd w:id="56"/>
+    <w:bookmarkEnd w:id="57"/>
+    <w:bookmarkStart w:id="60" w:name="schattenmodell"/>
     <w:p>
       <w:pPr>
         <w:pStyle w:val="Heading1"/>
@@ -6405,7 +9023,7 @@
         <w:t xml:space="preserve">Das Schattenmodell ist geometrisch vereinfacht. Es nutzt Sonnenhöhe, Sonnenazimut, Gebäudehöhe und Vegetationshöhe.</w:t>
       </w:r>
     </w:p>
-    <w:bookmarkStart w:id="47" w:name="gebäudeschatten"/>
+    <w:bookmarkStart w:id="58" w:name="gebäudeschatten"/>
     <w:p>
       <w:pPr>
         <w:pStyle w:val="Heading2"/>
@@ -6921,8 +9539,8 @@
         <w:t xml:space="preserve">Gebäude verschatten keine anderen Gebäudepatches. Ziel ist die Wirkung auf Aufenthaltsflächen.</w:t>
       </w:r>
     </w:p>
-    <w:bookmarkEnd w:id="47"/>
-    <w:bookmarkStart w:id="48" w:name="vegetationsschatten"/>
+    <w:bookmarkEnd w:id="58"/>
+    <w:bookmarkStart w:id="59" w:name="vegetationsschatten"/>
     <w:p>
       <w:pPr>
         <w:pStyle w:val="Heading2"/>
@@ -8265,9 +10883,9 @@
         </m:oMath>
       </m:oMathPara>
     </w:p>
-    <w:bookmarkEnd w:id="48"/>
-    <w:bookmarkEnd w:id="49"/>
-    <w:bookmarkStart w:id="57" w:name="oberflächenenergiebilanz"/>
+    <w:bookmarkEnd w:id="59"/>
+    <w:bookmarkEnd w:id="60"/>
+    <w:bookmarkStart w:id="68" w:name="oberflächenenergiebilanz"/>
     <w:p>
       <w:pPr>
         <w:pStyle w:val="Heading1"/>
@@ -8312,7 +10930,7 @@
         <w:pStyle w:val="Compact"/>
         <w:numPr>
           <w:ilvl w:val="0"/>
-          <w:numId w:val="1006"/>
+          <w:numId w:val="1009"/>
         </w:numPr>
       </w:pPr>
       <w:r>
@@ -8324,7 +10942,7 @@
         <w:pStyle w:val="Compact"/>
         <w:numPr>
           <w:ilvl w:val="0"/>
-          <w:numId w:val="1006"/>
+          <w:numId w:val="1009"/>
         </w:numPr>
       </w:pPr>
       <w:r>
@@ -8336,7 +10954,7 @@
         <w:pStyle w:val="Compact"/>
         <w:numPr>
           <w:ilvl w:val="0"/>
-          <w:numId w:val="1006"/>
+          <w:numId w:val="1009"/>
         </w:numPr>
       </w:pPr>
       <w:r>
@@ -8348,7 +10966,7 @@
         <w:pStyle w:val="Compact"/>
         <w:numPr>
           <w:ilvl w:val="0"/>
-          <w:numId w:val="1006"/>
+          <w:numId w:val="1009"/>
         </w:numPr>
       </w:pPr>
       <w:r>
@@ -8360,7 +10978,7 @@
         <w:pStyle w:val="Compact"/>
         <w:numPr>
           <w:ilvl w:val="0"/>
-          <w:numId w:val="1006"/>
+          <w:numId w:val="1009"/>
         </w:numPr>
       </w:pPr>
       <w:r>
@@ -8372,14 +10990,14 @@
         <w:pStyle w:val="Compact"/>
         <w:numPr>
           <w:ilvl w:val="0"/>
-          <w:numId w:val="1006"/>
+          <w:numId w:val="1009"/>
         </w:numPr>
       </w:pPr>
       <w:r>
         <w:t xml:space="preserve">Bodenwärmefluss</w:t>
       </w:r>
     </w:p>
-    <w:bookmarkStart w:id="50" w:name="solare-einstrahlung-auf-einen-patch"/>
+    <w:bookmarkStart w:id="61" w:name="solare-einstrahlung-auf-einen-patch"/>
     <w:p>
       <w:pPr>
         <w:pStyle w:val="Heading2"/>
@@ -8644,8 +11262,8 @@
         </m:oMath>
       </m:oMathPara>
     </w:p>
-    <w:bookmarkEnd w:id="50"/>
-    <w:bookmarkStart w:id="51" w:name="absorbierte-kurzwellige-strahlung"/>
+    <w:bookmarkEnd w:id="61"/>
+    <w:bookmarkStart w:id="62" w:name="absorbierte-kurzwellige-strahlung"/>
     <w:p>
       <w:pPr>
         <w:pStyle w:val="Heading2"/>
@@ -8834,8 +11452,8 @@
         <w:t xml:space="preserve">der Reflexionsanteil des Materials.</w:t>
       </w:r>
     </w:p>
-    <w:bookmarkEnd w:id="51"/>
-    <w:bookmarkStart w:id="52" w:name="wandnahe-zusätzliche-strahlung"/>
+    <w:bookmarkEnd w:id="62"/>
+    <w:bookmarkStart w:id="63" w:name="wandnahe-zusätzliche-strahlung"/>
     <w:p>
       <w:pPr>
         <w:pStyle w:val="Heading2"/>
@@ -9384,8 +12002,8 @@
         <w:t xml:space="preserve">Damit wird berücksichtigt, dass die Wand eine angrenzende Strahlungsquelle ist, aber nicht die ganze Patchoberfläche bildet.</w:t>
       </w:r>
     </w:p>
-    <w:bookmarkEnd w:id="52"/>
-    <w:bookmarkStart w:id="53" w:name="langwellige-bilanz"/>
+    <w:bookmarkEnd w:id="63"/>
+    <w:bookmarkStart w:id="64" w:name="langwellige-bilanz"/>
     <w:p>
       <w:pPr>
         <w:pStyle w:val="Heading2"/>
@@ -9893,8 +12511,8 @@
         <w:t xml:space="preserve">ist negativ, wenn die Oberfläche langwellig mehr Energie verliert als sie erhält.</w:t>
       </w:r>
     </w:p>
-    <w:bookmarkEnd w:id="53"/>
-    <w:bookmarkStart w:id="54" w:name="fühlbarer-wärmefluss"/>
+    <w:bookmarkEnd w:id="64"/>
+    <w:bookmarkStart w:id="65" w:name="fühlbarer-wärmefluss"/>
     <w:p>
       <w:pPr>
         <w:pStyle w:val="Heading2"/>
@@ -10512,8 +13130,8 @@
         </m:oMath>
       </m:oMathPara>
     </w:p>
-    <w:bookmarkEnd w:id="54"/>
-    <w:bookmarkStart w:id="55" w:name="effektive-oberflächenwärmekapazität"/>
+    <w:bookmarkEnd w:id="65"/>
+    <w:bookmarkStart w:id="66" w:name="effektive-oberflächenwärmekapazität"/>
     <w:p>
       <w:pPr>
         <w:pStyle w:val="Heading2"/>
@@ -10907,8 +13525,8 @@
         <w:t xml:space="preserve">Diese Werte steuern, wie schnell eine Oberfläche auf Energieflüsse reagiert. Rasen wird in der aktuellen Version schnell auskühlend modelliert. Baum und Hecke bleiben stärker gedämpft.</w:t>
       </w:r>
     </w:p>
-    <w:bookmarkEnd w:id="55"/>
-    <w:bookmarkStart w:id="56" w:name="substratkopplung"/>
+    <w:bookmarkEnd w:id="66"/>
+    <w:bookmarkStart w:id="67" w:name="substratkopplung"/>
     <w:p>
       <w:pPr>
         <w:pStyle w:val="Heading2"/>
@@ -11937,9 +14555,9 @@
         </m:oMath>
       </m:oMathPara>
     </w:p>
-    <w:bookmarkEnd w:id="56"/>
-    <w:bookmarkEnd w:id="57"/>
-    <w:bookmarkStart w:id="62" w:name="verdunstung-und-latenter-wärmefluss"/>
+    <w:bookmarkEnd w:id="67"/>
+    <w:bookmarkEnd w:id="68"/>
+    <w:bookmarkStart w:id="73" w:name="verdunstung-und-latenter-wärmefluss"/>
     <w:p>
       <w:pPr>
         <w:pStyle w:val="Heading1"/>
@@ -11948,7 +14566,7 @@
         <w:t xml:space="preserve">Verdunstung und latenter Wärmefluss</w:t>
       </w:r>
     </w:p>
-    <w:bookmarkStart w:id="58" w:name="wasserverfügbarkeit"/>
+    <w:bookmarkStart w:id="69" w:name="wasserverfügbarkeit"/>
     <w:p>
       <w:pPr>
         <w:pStyle w:val="Heading2"/>
@@ -12257,8 +14875,8 @@
         <w:t xml:space="preserve">Unter 5 Prozent Speicherfüllung wird praktisch keine Verdunstung angenommen. Ab etwa 85 Prozent Speicherfüllung ist die Verdunstung nicht mehr wasserlimitiert.</w:t>
       </w:r>
     </w:p>
-    <w:bookmarkEnd w:id="58"/>
-    <w:bookmarkStart w:id="59" w:name="sättigungsdampfdruck"/>
+    <w:bookmarkEnd w:id="69"/>
+    <w:bookmarkStart w:id="70" w:name="sättigungsdampfdruck"/>
     <w:p>
       <w:pPr>
         <w:pStyle w:val="Heading2"/>
@@ -12668,8 +15286,8 @@
         </m:oMath>
       </m:oMathPara>
     </w:p>
-    <w:bookmarkEnd w:id="59"/>
-    <w:bookmarkStart w:id="60" w:name="potenzielle-verdunstungsleistung"/>
+    <w:bookmarkEnd w:id="70"/>
+    <w:bookmarkStart w:id="71" w:name="potenzielle-verdunstungsleistung"/>
     <w:p>
       <w:pPr>
         <w:pStyle w:val="Heading2"/>
@@ -13553,8 +16171,8 @@
         </m:oMath>
       </m:oMathPara>
     </w:p>
-    <w:bookmarkEnd w:id="60"/>
-    <w:bookmarkStart w:id="61" w:name="wasserlimit"/>
+    <w:bookmarkEnd w:id="71"/>
+    <w:bookmarkStart w:id="72" w:name="wasserlimit"/>
     <w:p>
       <w:pPr>
         <w:pStyle w:val="Heading2"/>
@@ -14305,9 +16923,9 @@
         </m:oMath>
       </m:oMathPara>
     </w:p>
-    <w:bookmarkEnd w:id="61"/>
-    <w:bookmarkEnd w:id="62"/>
-    <w:bookmarkStart w:id="65" w:name="änderung-der-oberflächentemperatur"/>
+    <w:bookmarkEnd w:id="72"/>
+    <w:bookmarkEnd w:id="73"/>
+    <w:bookmarkStart w:id="76" w:name="änderung-der-oberflächentemperatur"/>
     <w:p>
       <w:pPr>
         <w:pStyle w:val="Heading1"/>
@@ -14694,7 +17312,7 @@
         <w:t xml:space="preserve">Die Änderung wird materialabhängig begrenzt. Dabei wird zwischen Erwärmung und Abkühlung unterschieden.</w:t>
       </w:r>
     </w:p>
-    <w:bookmarkStart w:id="63" w:name="maximale-erwärmungsraten"/>
+    <w:bookmarkStart w:id="74" w:name="maximale-erwärmungsraten"/>
     <w:p>
       <w:pPr>
         <w:pStyle w:val="Heading2"/>
@@ -15042,8 +17660,8 @@
         </w:tc>
       </w:tr>
     </w:tbl>
-    <w:bookmarkEnd w:id="63"/>
-    <w:bookmarkStart w:id="64" w:name="maximale-abkühlungsraten"/>
+    <w:bookmarkEnd w:id="74"/>
+    <w:bookmarkStart w:id="75" w:name="maximale-abkühlungsraten"/>
     <w:p>
       <w:pPr>
         <w:pStyle w:val="Heading2"/>
@@ -15399,9 +18017,9 @@
         <w:t xml:space="preserve">Diese asymmetrische Kappung ist wichtig. Rasen darf sich langsam erwärmen, aber schnell auskühlen. Dadurch bleibt die didaktisch gewünschte Dynamik erhalten: Rasen wird nicht wie ein starker Wärmespeicher behandelt.</w:t>
       </w:r>
     </w:p>
-    <w:bookmarkEnd w:id="64"/>
-    <w:bookmarkEnd w:id="65"/>
-    <w:bookmarkStart w:id="75" w:name="bodennahes-luftfeld"/>
+    <w:bookmarkEnd w:id="75"/>
+    <w:bookmarkEnd w:id="76"/>
+    <w:bookmarkStart w:id="86" w:name="bodennahes-luftfeld"/>
     <w:p>
       <w:pPr>
         <w:pStyle w:val="Heading1"/>
@@ -15418,7 +18036,7 @@
         <w:t xml:space="preserve">Nach dem Oberflächenupdate wird die lokale Lufttemperatur berechnet.</w:t>
       </w:r>
     </w:p>
-    <w:bookmarkStart w:id="66" w:name="oberflächen-footprint"/>
+    <w:bookmarkStart w:id="77" w:name="oberflächen-footprint"/>
     <w:p>
       <w:pPr>
         <w:pStyle w:val="Heading2"/>
@@ -15710,8 +18328,8 @@
         </m:oMath>
       </m:oMathPara>
     </w:p>
-    <w:bookmarkEnd w:id="66"/>
-    <w:bookmarkStart w:id="67" w:name="horizontale-luftmischung"/>
+    <w:bookmarkEnd w:id="77"/>
+    <w:bookmarkStart w:id="78" w:name="horizontale-luftmischung"/>
     <w:p>
       <w:pPr>
         <w:pStyle w:val="Heading2"/>
@@ -15939,8 +18557,8 @@
         </m:oMath>
       </m:oMathPara>
     </w:p>
-    <w:bookmarkEnd w:id="67"/>
-    <w:bookmarkStart w:id="68" w:name="oberfläche-luft-kopplung"/>
+    <w:bookmarkEnd w:id="78"/>
+    <w:bookmarkStart w:id="79" w:name="oberfläche-luft-kopplung"/>
     <w:p>
       <w:pPr>
         <w:pStyle w:val="Heading2"/>
@@ -16682,8 +19300,8 @@
         </m:oMath>
       </m:oMathPara>
     </w:p>
-    <w:bookmarkEnd w:id="68"/>
-    <w:bookmarkStart w:id="69" w:name="vertikale-mischung"/>
+    <w:bookmarkEnd w:id="79"/>
+    <w:bookmarkStart w:id="80" w:name="vertikale-mischung"/>
     <w:p>
       <w:pPr>
         <w:pStyle w:val="Heading2"/>
@@ -17294,8 +19912,8 @@
         </m:oMath>
       </m:oMathPara>
     </w:p>
-    <w:bookmarkEnd w:id="69"/>
-    <w:bookmarkStart w:id="70" w:name="fassadenwärmelast"/>
+    <w:bookmarkEnd w:id="80"/>
+    <w:bookmarkStart w:id="81" w:name="fassadenwärmelast"/>
     <w:p>
       <w:pPr>
         <w:pStyle w:val="Heading2"/>
@@ -17678,8 +20296,8 @@
         </m:oMath>
       </m:oMathPara>
     </w:p>
-    <w:bookmarkEnd w:id="70"/>
-    <w:bookmarkStart w:id="71" w:name="Xaee6898fe5894aa64b5eea7044a3feb93a58632"/>
+    <w:bookmarkEnd w:id="81"/>
+    <w:bookmarkStart w:id="82" w:name="Xaee6898fe5894aa64b5eea7044a3feb93a58632"/>
     <w:p>
       <w:pPr>
         <w:pStyle w:val="Heading2"/>
@@ -18604,8 +21222,8 @@
         </m:oMath>
       </m:oMathPara>
     </w:p>
-    <w:bookmarkEnd w:id="71"/>
-    <w:bookmarkStart w:id="72" w:name="direkte-luftkühlung-durch-rasen"/>
+    <w:bookmarkEnd w:id="82"/>
+    <w:bookmarkStart w:id="83" w:name="direkte-luftkühlung-durch-rasen"/>
     <w:p>
       <w:pPr>
         <w:pStyle w:val="Heading2"/>
@@ -19498,8 +22116,8 @@
         </m:oMath>
       </m:oMathPara>
     </w:p>
-    <w:bookmarkEnd w:id="72"/>
-    <w:bookmarkStart w:id="73" w:name="gesamte-lufttemperaturänderung"/>
+    <w:bookmarkEnd w:id="83"/>
+    <w:bookmarkStart w:id="84" w:name="gesamte-lufttemperaturänderung"/>
     <w:p>
       <w:pPr>
         <w:pStyle w:val="Heading2"/>
@@ -20052,8 +22670,8 @@
         <w:t xml:space="preserve">Die Änderung wird materialabhängig begrenzt.</w:t>
       </w:r>
     </w:p>
-    <w:bookmarkEnd w:id="73"/>
-    <w:bookmarkStart w:id="74" w:name="maximale-lokale-luftänderung"/>
+    <w:bookmarkEnd w:id="84"/>
+    <w:bookmarkStart w:id="85" w:name="maximale-lokale-luftänderung"/>
     <w:p>
       <w:pPr>
         <w:pStyle w:val="Heading2"/>
@@ -20401,9 +23019,9 @@
         </w:tc>
       </w:tr>
     </w:tbl>
-    <w:bookmarkEnd w:id="74"/>
-    <w:bookmarkEnd w:id="75"/>
-    <w:bookmarkStart w:id="83" w:name="aufenthaltsbelastung"/>
+    <w:bookmarkEnd w:id="85"/>
+    <w:bookmarkEnd w:id="86"/>
+    <w:bookmarkStart w:id="94" w:name="aufenthaltsbelastung"/>
     <w:p>
       <w:pPr>
         <w:pStyle w:val="Heading1"/>
@@ -20443,7 +23061,7 @@
         <w:t xml:space="preserve">Dieser Index ist kein medizinischer Hitzestressindex. Er ist ein didaktischer Proxy für Aufenthaltsbelastung.</w:t>
       </w:r>
     </w:p>
-    <w:bookmarkStart w:id="76" w:name="direkte-sonne"/>
+    <w:bookmarkStart w:id="87" w:name="direkte-sonne"/>
     <w:p>
       <w:pPr>
         <w:pStyle w:val="Heading2"/>
@@ -20763,8 +23381,8 @@
         </m:oMath>
       </m:oMathPara>
     </w:p>
-    <w:bookmarkEnd w:id="76"/>
-    <w:bookmarkStart w:id="77" w:name="langwellige-und-oberflächenbelastung"/>
+    <w:bookmarkEnd w:id="87"/>
+    <w:bookmarkStart w:id="88" w:name="langwellige-und-oberflächenbelastung"/>
     <w:p>
       <w:pPr>
         <w:pStyle w:val="Heading2"/>
@@ -21815,8 +24433,8 @@
         </m:oMath>
       </m:oMathPara>
     </w:p>
-    <w:bookmarkEnd w:id="77"/>
-    <w:bookmarkStart w:id="78" w:name="feuchtebelastung"/>
+    <w:bookmarkEnd w:id="88"/>
+    <w:bookmarkStart w:id="89" w:name="feuchtebelastung"/>
     <w:p>
       <w:pPr>
         <w:pStyle w:val="Heading2"/>
@@ -21949,8 +24567,8 @@
         </m:oMath>
       </m:oMathPara>
     </w:p>
-    <w:bookmarkEnd w:id="78"/>
-    <w:bookmarkStart w:id="79" w:name="windentlastung"/>
+    <w:bookmarkEnd w:id="89"/>
+    <w:bookmarkStart w:id="90" w:name="windentlastung"/>
     <w:p>
       <w:pPr>
         <w:pStyle w:val="Heading2"/>
@@ -22205,8 +24823,8 @@
         </m:oMath>
       </m:oMathPara>
     </w:p>
-    <w:bookmarkEnd w:id="79"/>
-    <w:bookmarkStart w:id="80" w:name="vegetationsentlastung"/>
+    <w:bookmarkEnd w:id="90"/>
+    <w:bookmarkStart w:id="91" w:name="vegetationsentlastung"/>
     <w:p>
       <w:pPr>
         <w:pStyle w:val="Heading2"/>
@@ -22302,8 +24920,8 @@
         </m:oMath>
       </m:oMathPara>
     </w:p>
-    <w:bookmarkEnd w:id="80"/>
-    <w:bookmarkStart w:id="81" w:name="fassaden-et-entlastung-im-komfortindex"/>
+    <w:bookmarkEnd w:id="91"/>
+    <w:bookmarkStart w:id="92" w:name="fassaden-et-entlastung-im-komfortindex"/>
     <w:p>
       <w:pPr>
         <w:pStyle w:val="Heading2"/>
@@ -22588,8 +25206,8 @@
         </m:oMath>
       </m:oMathPara>
     </w:p>
-    <w:bookmarkEnd w:id="81"/>
-    <w:bookmarkStart w:id="82" w:name="gesamter-aufenthaltsindex"/>
+    <w:bookmarkEnd w:id="92"/>
+    <w:bookmarkStart w:id="93" w:name="gesamter-aufenthaltsindex"/>
     <w:p>
       <w:pPr>
         <w:pStyle w:val="Heading2"/>
@@ -23020,9 +25638,9 @@
         <w:t xml:space="preserve">.</w:t>
       </w:r>
     </w:p>
-    <w:bookmarkEnd w:id="82"/>
-    <w:bookmarkEnd w:id="83"/>
-    <w:bookmarkStart w:id="88" w:name="hitzelast-über-die-schulzeit"/>
+    <w:bookmarkEnd w:id="93"/>
+    <w:bookmarkEnd w:id="94"/>
+    <w:bookmarkStart w:id="99" w:name="hitzelast-über-die-schulzeit"/>
     <w:p>
       <w:pPr>
         <w:pStyle w:val="Heading1"/>
@@ -23110,7 +25728,7 @@
         <w:t xml:space="preserve">ein Belastungsfaktor zwischen 0 und 1 berechnet.</w:t>
       </w:r>
     </w:p>
-    <w:bookmarkStart w:id="84" w:name="belastungsfaktor-sommer"/>
+    <w:bookmarkStart w:id="95" w:name="belastungsfaktor-sommer"/>
     <w:p>
       <w:pPr>
         <w:pStyle w:val="Heading2"/>
@@ -23605,8 +26223,8 @@
         </m:oMath>
       </m:oMathPara>
     </w:p>
-    <w:bookmarkEnd w:id="84"/>
-    <w:bookmarkStart w:id="85" w:name="belastungsfaktor-frühlingherbst"/>
+    <w:bookmarkEnd w:id="95"/>
+    <w:bookmarkStart w:id="96" w:name="belastungsfaktor-frühlingherbst"/>
     <w:p>
       <w:pPr>
         <w:pStyle w:val="Heading2"/>
@@ -23951,8 +26569,8 @@
         </m:oMath>
       </m:oMathPara>
     </w:p>
-    <w:bookmarkEnd w:id="85"/>
-    <w:bookmarkStart w:id="86" w:name="belastungsfaktor-winter"/>
+    <w:bookmarkEnd w:id="96"/>
+    <w:bookmarkStart w:id="97" w:name="belastungsfaktor-winter"/>
     <w:p>
       <w:pPr>
         <w:pStyle w:val="Heading2"/>
@@ -24297,8 +26915,8 @@
         </m:oMath>
       </m:oMathPara>
     </w:p>
-    <w:bookmarkEnd w:id="86"/>
-    <w:bookmarkStart w:id="87" w:name="dosisgrößen"/>
+    <w:bookmarkEnd w:id="97"/>
+    <w:bookmarkStart w:id="98" w:name="dosisgrößen"/>
     <w:p>
       <w:pPr>
         <w:pStyle w:val="Heading2"/>
@@ -24940,9 +27558,9 @@
         <w:t xml:space="preserve">. Sie wird als äquivalente Belastungsstunden während der Schulzeit gelesen.</w:t>
       </w:r>
     </w:p>
-    <w:bookmarkEnd w:id="87"/>
-    <w:bookmarkEnd w:id="88"/>
-    <w:bookmarkStart w:id="89" w:name="hitzelastklassen"/>
+    <w:bookmarkEnd w:id="98"/>
+    <w:bookmarkEnd w:id="99"/>
+    <w:bookmarkStart w:id="100" w:name="hitzelastklassen"/>
     <w:p>
       <w:pPr>
         <w:pStyle w:val="Heading1"/>
@@ -25198,8 +27816,8 @@
         <w:t xml:space="preserve">Die gleiche Klassifikation wird für Kartenansicht, Monitoring und Vorher/Nachher-Vergleich genutzt.</w:t>
       </w:r>
     </w:p>
-    <w:bookmarkEnd w:id="89"/>
-    <w:bookmarkStart w:id="90" w:name="aufenthaltsflächen"/>
+    <w:bookmarkEnd w:id="100"/>
+    <w:bookmarkStart w:id="101" w:name="aufenthaltsflächen"/>
     <w:p>
       <w:pPr>
         <w:pStyle w:val="Heading1"/>
@@ -25251,7 +27869,7 @@
         <w:pStyle w:val="Compact"/>
         <w:numPr>
           <w:ilvl w:val="0"/>
-          <w:numId w:val="1007"/>
+          <w:numId w:val="1010"/>
         </w:numPr>
       </w:pPr>
       <w:r>
@@ -25263,7 +27881,7 @@
         <w:pStyle w:val="Compact"/>
         <w:numPr>
           <w:ilvl w:val="0"/>
-          <w:numId w:val="1007"/>
+          <w:numId w:val="1010"/>
         </w:numPr>
       </w:pPr>
       <w:r>
@@ -25275,7 +27893,7 @@
         <w:pStyle w:val="Compact"/>
         <w:numPr>
           <w:ilvl w:val="0"/>
-          <w:numId w:val="1007"/>
+          <w:numId w:val="1010"/>
         </w:numPr>
       </w:pPr>
       <w:r>
@@ -25287,7 +27905,7 @@
         <w:pStyle w:val="Compact"/>
         <w:numPr>
           <w:ilvl w:val="0"/>
-          <w:numId w:val="1007"/>
+          <w:numId w:val="1010"/>
         </w:numPr>
       </w:pPr>
       <w:r>
@@ -25299,7 +27917,7 @@
         <w:pStyle w:val="Compact"/>
         <w:numPr>
           <w:ilvl w:val="0"/>
-          <w:numId w:val="1007"/>
+          <w:numId w:val="1010"/>
         </w:numPr>
       </w:pPr>
       <w:r>
@@ -25311,7 +27929,7 @@
         <w:pStyle w:val="Compact"/>
         <w:numPr>
           <w:ilvl w:val="0"/>
-          <w:numId w:val="1007"/>
+          <w:numId w:val="1010"/>
         </w:numPr>
       </w:pPr>
       <w:r>
@@ -25326,8 +27944,8 @@
         <w:t xml:space="preserve">Gebäude, Bäume und Hecken werden nicht als Aufenthaltsfläche gezählt.</w:t>
       </w:r>
     </w:p>
-    <w:bookmarkEnd w:id="90"/>
-    <w:bookmarkStart w:id="92" w:name="kartenansichten"/>
+    <w:bookmarkEnd w:id="101"/>
+    <w:bookmarkStart w:id="103" w:name="kartenansichten"/>
     <w:p>
       <w:pPr>
         <w:pStyle w:val="Heading1"/>
@@ -25565,7 +28183,7 @@
         </w:tc>
       </w:tr>
     </w:tbl>
-    <w:bookmarkStart w:id="91" w:name="hitzelast-änderung"/>
+    <w:bookmarkStart w:id="102" w:name="hitzelast-änderung"/>
     <w:p>
       <w:pPr>
         <w:pStyle w:val="Heading2"/>
@@ -25988,9 +28606,9 @@
         </w:tc>
       </w:tr>
     </w:tbl>
-    <w:bookmarkEnd w:id="91"/>
-    <w:bookmarkEnd w:id="92"/>
-    <w:bookmarkStart w:id="94" w:name="vorhernachher-vergleich"/>
+    <w:bookmarkEnd w:id="102"/>
+    <w:bookmarkEnd w:id="103"/>
+    <w:bookmarkStart w:id="105" w:name="vorhernachher-vergleich"/>
     <w:p>
       <w:pPr>
         <w:pStyle w:val="Heading1"/>
@@ -26005,474 +28623,6 @@
       </w:pPr>
       <w:r>
         <w:t xml:space="preserve">Der Vergleich nutzt keine externe Datei. Die Referenz wird im laufenden Modellzustand in den Patch-Variablen gespeichert:</w:t>
-      </w:r>
-    </w:p>
-    <w:p>
-      <w:pPr>
-        <w:pStyle w:val="Compact"/>
-        <w:numPr>
-          <w:ilvl w:val="0"/>
-          <w:numId w:val="1008"/>
-        </w:numPr>
-      </w:pPr>
-      <w:r>
-        <w:rPr>
-          <w:rStyle w:val="VerbatimChar"/>
-        </w:rPr>
-        <w:t xml:space="preserve">ref-active?</w:t>
-      </w:r>
-    </w:p>
-    <w:p>
-      <w:pPr>
-        <w:pStyle w:val="Compact"/>
-        <w:numPr>
-          <w:ilvl w:val="0"/>
-          <w:numId w:val="1008"/>
-        </w:numPr>
-      </w:pPr>
-      <w:r>
-        <w:rPr>
-          <w:rStyle w:val="VerbatimChar"/>
-        </w:rPr>
-        <w:t xml:space="preserve">ref-heat-dose-comfort</w:t>
-      </w:r>
-    </w:p>
-    <w:p>
-      <w:pPr>
-        <w:pStyle w:val="Compact"/>
-        <w:numPr>
-          <w:ilvl w:val="0"/>
-          <w:numId w:val="1008"/>
-        </w:numPr>
-      </w:pPr>
-      <w:r>
-        <w:rPr>
-          <w:rStyle w:val="VerbatimChar"/>
-        </w:rPr>
-        <w:t xml:space="preserve">ref-heat-dose-air</w:t>
-      </w:r>
-    </w:p>
-    <w:p>
-      <w:pPr>
-        <w:pStyle w:val="Compact"/>
-        <w:numPr>
-          <w:ilvl w:val="0"/>
-          <w:numId w:val="1008"/>
-        </w:numPr>
-      </w:pPr>
-      <w:r>
-        <w:rPr>
-          <w:rStyle w:val="VerbatimChar"/>
-        </w:rPr>
-        <w:t xml:space="preserve">ref-heat-dose-surface</w:t>
-      </w:r>
-    </w:p>
-    <w:p>
-      <w:pPr>
-        <w:pStyle w:val="Compact"/>
-        <w:numPr>
-          <w:ilvl w:val="0"/>
-          <w:numId w:val="1008"/>
-        </w:numPr>
-      </w:pPr>
-      <w:r>
-        <w:rPr>
-          <w:rStyle w:val="VerbatimChar"/>
-        </w:rPr>
-        <w:t xml:space="preserve">ref-comfort-index</w:t>
-      </w:r>
-    </w:p>
-    <w:p>
-      <w:pPr>
-        <w:pStyle w:val="Compact"/>
-        <w:numPr>
-          <w:ilvl w:val="0"/>
-          <w:numId w:val="1008"/>
-        </w:numPr>
-      </w:pPr>
-      <w:r>
-        <w:rPr>
-          <w:rStyle w:val="VerbatimChar"/>
-        </w:rPr>
-        <w:t xml:space="preserve">ref-comfort-index-max</w:t>
-      </w:r>
-    </w:p>
-    <w:p>
-      <w:pPr>
-        <w:pStyle w:val="Compact"/>
-        <w:numPr>
-          <w:ilvl w:val="0"/>
-          <w:numId w:val="1008"/>
-        </w:numPr>
-      </w:pPr>
-      <w:r>
-        <w:rPr>
-          <w:rStyle w:val="VerbatimChar"/>
-        </w:rPr>
-        <w:t xml:space="preserve">ref-shadow-level</w:t>
-      </w:r>
-    </w:p>
-    <w:p>
-      <w:pPr>
-        <w:pStyle w:val="FirstParagraph"/>
-      </w:pPr>
-      <w:r>
-        <w:t xml:space="preserve">Die Referenz gilt global für die gesamte Karte. Eine spätere Auswahl wird nur verwendet, um einen Teilbereich auszuwerten.</w:t>
-      </w:r>
-    </w:p>
-    <w:bookmarkStart w:id="93" w:name="vergleichsmetriken"/>
-    <w:p>
-      <w:pPr>
-        <w:pStyle w:val="Heading2"/>
-      </w:pPr>
-      <w:r>
-        <w:t xml:space="preserve">Vergleichsmetriken</w:t>
-      </w:r>
-    </w:p>
-    <w:p>
-      <w:pPr>
-        <w:pStyle w:val="FirstParagraph"/>
-      </w:pPr>
-      <w:r>
-        <w:t xml:space="preserve">Für eine ausgewählte Fläche werden berechnet:</w:t>
-      </w:r>
-    </w:p>
-    <w:p>
-      <w:pPr>
-        <w:pStyle w:val="Compact"/>
-        <w:numPr>
-          <w:ilvl w:val="0"/>
-          <w:numId w:val="1009"/>
-        </w:numPr>
-      </w:pPr>
-      <w:r>
-        <w:t xml:space="preserve">mittlere Hitzelast vorher/nachher</w:t>
-      </w:r>
-    </w:p>
-    <w:p>
-      <w:pPr>
-        <w:pStyle w:val="Compact"/>
-        <w:numPr>
-          <w:ilvl w:val="0"/>
-          <w:numId w:val="1009"/>
-        </w:numPr>
-      </w:pPr>
-      <w:r>
-        <w:t xml:space="preserve">maximale Hitzelast vorher/nachher</w:t>
-      </w:r>
-    </w:p>
-    <w:p>
-      <w:pPr>
-        <w:pStyle w:val="Compact"/>
-        <w:numPr>
-          <w:ilvl w:val="0"/>
-          <w:numId w:val="1009"/>
-        </w:numPr>
-      </w:pPr>
-      <w:r>
-        <w:t xml:space="preserve">Schattenanteil vorher/nachher</w:t>
-      </w:r>
-    </w:p>
-    <w:p>
-      <w:pPr>
-        <w:pStyle w:val="Compact"/>
-        <w:numPr>
-          <w:ilvl w:val="0"/>
-          <w:numId w:val="1009"/>
-        </w:numPr>
-      </w:pPr>
-      <w:r>
-        <w:t xml:space="preserve">Luftwärmedosis vorher/nachher</w:t>
-      </w:r>
-    </w:p>
-    <w:p>
-      <w:pPr>
-        <w:pStyle w:val="Compact"/>
-        <w:numPr>
-          <w:ilvl w:val="0"/>
-          <w:numId w:val="1009"/>
-        </w:numPr>
-      </w:pPr>
-      <w:r>
-        <w:t xml:space="preserve">Oberflächenwärme vorher/nachher</w:t>
-      </w:r>
-    </w:p>
-    <w:p>
-      <w:pPr>
-        <w:pStyle w:val="Compact"/>
-        <w:numPr>
-          <w:ilvl w:val="0"/>
-          <w:numId w:val="1009"/>
-        </w:numPr>
-      </w:pPr>
-      <w:r>
-        <w:t xml:space="preserve">Anteil orange/rot</w:t>
-      </w:r>
-    </w:p>
-    <w:p>
-      <w:pPr>
-        <w:pStyle w:val="Compact"/>
-        <w:numPr>
-          <w:ilvl w:val="0"/>
-          <w:numId w:val="1009"/>
-        </w:numPr>
-      </w:pPr>
-      <w:r>
-        <w:t xml:space="preserve">Anteil rot</w:t>
-      </w:r>
-    </w:p>
-    <w:p>
-      <w:pPr>
-        <w:pStyle w:val="Compact"/>
-        <w:numPr>
-          <w:ilvl w:val="0"/>
-          <w:numId w:val="1009"/>
-        </w:numPr>
-      </w:pPr>
-      <w:r>
-        <w:t xml:space="preserve">Anteil blau/grün/gelb</w:t>
-      </w:r>
-    </w:p>
-    <w:p>
-      <w:pPr>
-        <w:pStyle w:val="Compact"/>
-        <w:numPr>
-          <w:ilvl w:val="0"/>
-          <w:numId w:val="1009"/>
-        </w:numPr>
-      </w:pPr>
-      <w:r>
-        <w:t xml:space="preserve">verbesserte Fläche</w:t>
-      </w:r>
-    </w:p>
-    <w:p>
-      <w:pPr>
-        <w:pStyle w:val="Compact"/>
-        <w:numPr>
-          <w:ilvl w:val="0"/>
-          <w:numId w:val="1009"/>
-        </w:numPr>
-      </w:pPr>
-      <w:r>
-        <w:t xml:space="preserve">mindestens eine Klasse besser</w:t>
-      </w:r>
-    </w:p>
-    <w:p>
-      <w:pPr>
-        <w:pStyle w:val="Compact"/>
-        <w:numPr>
-          <w:ilvl w:val="0"/>
-          <w:numId w:val="1009"/>
-        </w:numPr>
-      </w:pPr>
-      <w:r>
-        <w:t xml:space="preserve">mindestens zwei Klassen besser</w:t>
-      </w:r>
-    </w:p>
-    <w:p>
-      <w:pPr>
-        <w:pStyle w:val="Compact"/>
-        <w:numPr>
-          <w:ilvl w:val="0"/>
-          <w:numId w:val="1009"/>
-        </w:numPr>
-      </w:pPr>
-      <w:r>
-        <w:t xml:space="preserve">Klassenwanderungen aus kritischen Klassen</w:t>
-      </w:r>
-    </w:p>
-    <w:bookmarkEnd w:id="93"/>
-    <w:bookmarkEnd w:id="94"/>
-    <w:bookmarkStart w:id="95" w:name="web-version"/>
-    <w:p>
-      <w:pPr>
-        <w:pStyle w:val="Heading1"/>
-      </w:pPr>
-      <w:r>
-        <w:t xml:space="preserve">Web-Version</w:t>
-      </w:r>
-    </w:p>
-    <w:p>
-      <w:pPr>
-        <w:pStyle w:val="FirstParagraph"/>
-      </w:pPr>
-      <w:r>
-        <w:t xml:space="preserve">Die Web-Version deaktiviert die lokale Szenario-Dateiverwaltung. Es werden keine lokalen Dateien geschrieben oder gelesen.</w:t>
-      </w:r>
-    </w:p>
-    <w:p>
-      <w:pPr>
-        <w:pStyle w:val="BodyText"/>
-      </w:pPr>
-      <w:r>
-        <w:t xml:space="preserve">Dauerhaftes Speichern von Szenarien ist in der Web-Version nicht Teil der Modelllogik. Der Vorher/Nachher-Vergleich funktioniert nur innerhalb der laufenden Simulation im Browser. Nach Neuladen der Seite oder nach</w:t>
-      </w:r>
-      <w:r>
-        <w:t xml:space="preserve"> </w:t>
-      </w:r>
-      <w:r>
-        <w:rPr>
-          <w:rStyle w:val="VerbatimChar"/>
-        </w:rPr>
-        <w:t xml:space="preserve">Modellstart /-reset</w:t>
-      </w:r>
-      <w:r>
-        <w:t xml:space="preserve"> </w:t>
-      </w:r>
-      <w:r>
-        <w:t xml:space="preserve">ist der Vergleichszustand verloren.</w:t>
-      </w:r>
-    </w:p>
-    <w:p>
-      <w:pPr>
-        <w:pStyle w:val="BodyText"/>
-      </w:pPr>
-      <w:r>
-        <w:t xml:space="preserve">Die Web-Version nutzt die fest im Modell gespeicherte Referenzgeometrie.</w:t>
-      </w:r>
-    </w:p>
-    <w:bookmarkEnd w:id="95"/>
-    <w:bookmarkStart w:id="96" w:name="didaktische-interpretation"/>
-    <w:p>
-      <w:pPr>
-        <w:pStyle w:val="Heading1"/>
-      </w:pPr>
-      <w:r>
-        <w:t xml:space="preserve">Didaktische Interpretation</w:t>
-      </w:r>
-    </w:p>
-    <w:p>
-      <w:pPr>
-        <w:pStyle w:val="FirstParagraph"/>
-      </w:pPr>
-      <w:r>
-        <w:t xml:space="preserve">Das Modell soll folgende Einsichten sichtbar machen:</w:t>
-      </w:r>
-    </w:p>
-    <w:p>
-      <w:pPr>
-        <w:pStyle w:val="Compact"/>
-        <w:numPr>
-          <w:ilvl w:val="0"/>
-          <w:numId w:val="1010"/>
-        </w:numPr>
-      </w:pPr>
-      <w:r>
-        <w:t xml:space="preserve">Heiße Oberflächen und warme Luft sind nicht dasselbe.</w:t>
-      </w:r>
-    </w:p>
-    <w:p>
-      <w:pPr>
-        <w:pStyle w:val="Compact"/>
-        <w:numPr>
-          <w:ilvl w:val="0"/>
-          <w:numId w:val="1010"/>
-        </w:numPr>
-      </w:pPr>
-      <w:r>
-        <w:t xml:space="preserve">Schatten reduziert die direkte Aufheizung und die Aufenthaltsbelastung.</w:t>
-      </w:r>
-    </w:p>
-    <w:p>
-      <w:pPr>
-        <w:pStyle w:val="Compact"/>
-        <w:numPr>
-          <w:ilvl w:val="0"/>
-          <w:numId w:val="1010"/>
-        </w:numPr>
-      </w:pPr>
-      <w:r>
-        <w:t xml:space="preserve">Vegetation wirkt über Schatten und Verdunstung.</w:t>
-      </w:r>
-    </w:p>
-    <w:p>
-      <w:pPr>
-        <w:pStyle w:val="Compact"/>
-        <w:numPr>
-          <w:ilvl w:val="0"/>
-          <w:numId w:val="1010"/>
-        </w:numPr>
-      </w:pPr>
-      <w:r>
-        <w:t xml:space="preserve">Rasen wirkt anders als Baum, weil Baum zusätzlich 3D-Schatten erzeugt.</w:t>
-      </w:r>
-    </w:p>
-    <w:p>
-      <w:pPr>
-        <w:pStyle w:val="Compact"/>
-        <w:numPr>
-          <w:ilvl w:val="0"/>
-          <w:numId w:val="1010"/>
-        </w:numPr>
-      </w:pPr>
-      <w:r>
-        <w:t xml:space="preserve">Fassadenbegrünung wirkt lokal stark in der Nähe von Gebäuden, vor allem über reduzierte Wandwärmelast und ET-Entlastung.</w:t>
-      </w:r>
-    </w:p>
-    <w:p>
-      <w:pPr>
-        <w:pStyle w:val="Compact"/>
-        <w:numPr>
-          <w:ilvl w:val="0"/>
-          <w:numId w:val="1010"/>
-        </w:numPr>
-      </w:pPr>
-      <w:r>
-        <w:t xml:space="preserve">Gründächer verbessern Dachflächen, sind aber nicht automatisch stärker als bodengebundener Rasen.</w:t>
-      </w:r>
-    </w:p>
-    <w:p>
-      <w:pPr>
-        <w:pStyle w:val="Compact"/>
-        <w:numPr>
-          <w:ilvl w:val="0"/>
-          <w:numId w:val="1010"/>
-        </w:numPr>
-      </w:pPr>
-      <w:r>
-        <w:t xml:space="preserve">Asphalt, Sportbelag und trockene harte Oberflächen erzeugen hohe Oberflächentemperaturen.</w:t>
-      </w:r>
-    </w:p>
-    <w:p>
-      <w:pPr>
-        <w:pStyle w:val="Compact"/>
-        <w:numPr>
-          <w:ilvl w:val="0"/>
-          <w:numId w:val="1010"/>
-        </w:numPr>
-      </w:pPr>
-      <w:r>
-        <w:t xml:space="preserve">Die entscheidende Frage ist nicht nur, wo es kurzzeitig heiß ist, sondern wo sich während der Schulzeit Hitzelast aufsummiert.</w:t>
-      </w:r>
-    </w:p>
-    <w:p>
-      <w:pPr>
-        <w:pStyle w:val="Compact"/>
-        <w:numPr>
-          <w:ilvl w:val="0"/>
-          <w:numId w:val="1010"/>
-        </w:numPr>
-      </w:pPr>
-      <w:r>
-        <w:t xml:space="preserve">Maßnahmen sollen dort gesetzt werden, wo sie die belasteten Aufenthaltsflächen tatsächlich verbessern.</w:t>
-      </w:r>
-    </w:p>
-    <w:bookmarkEnd w:id="96"/>
-    <w:bookmarkStart w:id="97" w:name="modellgrenzen"/>
-    <w:p>
-      <w:pPr>
-        <w:pStyle w:val="Heading1"/>
-      </w:pPr>
-      <w:r>
-        <w:t xml:space="preserve">Modellgrenzen</w:t>
-      </w:r>
-    </w:p>
-    <w:p>
-      <w:pPr>
-        <w:pStyle w:val="FirstParagraph"/>
-      </w:pPr>
-      <w:r>
-        <w:t xml:space="preserve">Das Modell ist bewusst vereinfacht. Es enthält keine vollständige mikrometeorologische Stadtklimaphysik. Insbesondere werden nicht abgebildet:</w:t>
       </w:r>
     </w:p>
     <w:p>
@@ -26484,7 +28634,10 @@
         </w:numPr>
       </w:pPr>
       <w:r>
-        <w:t xml:space="preserve">echte 3D-Strömungsdynamik</w:t>
+        <w:rPr>
+          <w:rStyle w:val="VerbatimChar"/>
+        </w:rPr>
+        <w:t xml:space="preserve">ref-active?</w:t>
       </w:r>
     </w:p>
     <w:p>
@@ -26496,7 +28649,10 @@
         </w:numPr>
       </w:pPr>
       <w:r>
-        <w:t xml:space="preserve">turbulente Energiebilanz mit stabilitätsabhängiger Schichtung</w:t>
+        <w:rPr>
+          <w:rStyle w:val="VerbatimChar"/>
+        </w:rPr>
+        <w:t xml:space="preserve">ref-heat-dose-comfort</w:t>
       </w:r>
     </w:p>
     <w:p>
@@ -26508,7 +28664,10 @@
         </w:numPr>
       </w:pPr>
       <w:r>
-        <w:t xml:space="preserve">echte Gebäudewandorientierungen</w:t>
+        <w:rPr>
+          <w:rStyle w:val="VerbatimChar"/>
+        </w:rPr>
+        <w:t xml:space="preserve">ref-heat-dose-air</w:t>
       </w:r>
     </w:p>
     <w:p>
@@ -26520,7 +28679,10 @@
         </w:numPr>
       </w:pPr>
       <w:r>
-        <w:t xml:space="preserve">reale Bodenfeuchteprofile</w:t>
+        <w:rPr>
+          <w:rStyle w:val="VerbatimChar"/>
+        </w:rPr>
+        <w:t xml:space="preserve">ref-heat-dose-surface</w:t>
       </w:r>
     </w:p>
     <w:p>
@@ -26532,7 +28694,10 @@
         </w:numPr>
       </w:pPr>
       <w:r>
-        <w:t xml:space="preserve">echte Pflanzenphysiologie</w:t>
+        <w:rPr>
+          <w:rStyle w:val="VerbatimChar"/>
+        </w:rPr>
+        <w:t xml:space="preserve">ref-comfort-index</w:t>
       </w:r>
     </w:p>
     <w:p>
@@ -26544,7 +28709,10 @@
         </w:numPr>
       </w:pPr>
       <w:r>
-        <w:t xml:space="preserve">reale Wurzelräume</w:t>
+        <w:rPr>
+          <w:rStyle w:val="VerbatimChar"/>
+        </w:rPr>
+        <w:t xml:space="preserve">ref-comfort-index-max</w:t>
       </w:r>
     </w:p>
     <w:p>
@@ -26556,7 +28724,35 @@
         </w:numPr>
       </w:pPr>
       <w:r>
-        <w:t xml:space="preserve">Wolken, wechselnde Wetterlagen oder Niederschlagsereignisse</w:t>
+        <w:rPr>
+          <w:rStyle w:val="VerbatimChar"/>
+        </w:rPr>
+        <w:t xml:space="preserve">ref-shadow-level</w:t>
+      </w:r>
+    </w:p>
+    <w:p>
+      <w:pPr>
+        <w:pStyle w:val="FirstParagraph"/>
+      </w:pPr>
+      <w:r>
+        <w:t xml:space="preserve">Die Referenz gilt global für die gesamte Karte. Eine spätere Auswahl wird nur verwendet, um einen Teilbereich auszuwerten.</w:t>
+      </w:r>
+    </w:p>
+    <w:bookmarkStart w:id="104" w:name="vergleichsmetriken"/>
+    <w:p>
+      <w:pPr>
+        <w:pStyle w:val="Heading2"/>
+      </w:pPr>
+      <w:r>
+        <w:t xml:space="preserve">Vergleichsmetriken</w:t>
+      </w:r>
+    </w:p>
+    <w:p>
+      <w:pPr>
+        <w:pStyle w:val="FirstParagraph"/>
+      </w:pPr>
+      <w:r>
+        <w:t xml:space="preserve">Für eine ausgewählte Fläche werden berechnet:</w:t>
       </w:r>
     </w:p>
     <w:p>
@@ -26564,11 +28760,11 @@
         <w:pStyle w:val="Compact"/>
         <w:numPr>
           <w:ilvl w:val="0"/>
-          <w:numId w:val="1011"/>
+          <w:numId w:val="1012"/>
         </w:numPr>
       </w:pPr>
       <w:r>
-        <w:t xml:space="preserve">Kalibrierung gegen Messdaten</w:t>
+        <w:t xml:space="preserve">mittlere Hitzelast vorher/nachher</w:t>
       </w:r>
     </w:p>
     <w:p>
@@ -26576,10 +28772,432 @@
         <w:pStyle w:val="Compact"/>
         <w:numPr>
           <w:ilvl w:val="0"/>
-          <w:numId w:val="1011"/>
+          <w:numId w:val="1012"/>
         </w:numPr>
       </w:pPr>
       <w:r>
+        <w:t xml:space="preserve">maximale Hitzelast vorher/nachher</w:t>
+      </w:r>
+    </w:p>
+    <w:p>
+      <w:pPr>
+        <w:pStyle w:val="Compact"/>
+        <w:numPr>
+          <w:ilvl w:val="0"/>
+          <w:numId w:val="1012"/>
+        </w:numPr>
+      </w:pPr>
+      <w:r>
+        <w:t xml:space="preserve">Schattenanteil vorher/nachher</w:t>
+      </w:r>
+    </w:p>
+    <w:p>
+      <w:pPr>
+        <w:pStyle w:val="Compact"/>
+        <w:numPr>
+          <w:ilvl w:val="0"/>
+          <w:numId w:val="1012"/>
+        </w:numPr>
+      </w:pPr>
+      <w:r>
+        <w:t xml:space="preserve">Luftwärmedosis vorher/nachher</w:t>
+      </w:r>
+    </w:p>
+    <w:p>
+      <w:pPr>
+        <w:pStyle w:val="Compact"/>
+        <w:numPr>
+          <w:ilvl w:val="0"/>
+          <w:numId w:val="1012"/>
+        </w:numPr>
+      </w:pPr>
+      <w:r>
+        <w:t xml:space="preserve">Oberflächenwärme vorher/nachher</w:t>
+      </w:r>
+    </w:p>
+    <w:p>
+      <w:pPr>
+        <w:pStyle w:val="Compact"/>
+        <w:numPr>
+          <w:ilvl w:val="0"/>
+          <w:numId w:val="1012"/>
+        </w:numPr>
+      </w:pPr>
+      <w:r>
+        <w:t xml:space="preserve">Anteil orange/rot</w:t>
+      </w:r>
+    </w:p>
+    <w:p>
+      <w:pPr>
+        <w:pStyle w:val="Compact"/>
+        <w:numPr>
+          <w:ilvl w:val="0"/>
+          <w:numId w:val="1012"/>
+        </w:numPr>
+      </w:pPr>
+      <w:r>
+        <w:t xml:space="preserve">Anteil rot</w:t>
+      </w:r>
+    </w:p>
+    <w:p>
+      <w:pPr>
+        <w:pStyle w:val="Compact"/>
+        <w:numPr>
+          <w:ilvl w:val="0"/>
+          <w:numId w:val="1012"/>
+        </w:numPr>
+      </w:pPr>
+      <w:r>
+        <w:t xml:space="preserve">Anteil blau/grün/gelb</w:t>
+      </w:r>
+    </w:p>
+    <w:p>
+      <w:pPr>
+        <w:pStyle w:val="Compact"/>
+        <w:numPr>
+          <w:ilvl w:val="0"/>
+          <w:numId w:val="1012"/>
+        </w:numPr>
+      </w:pPr>
+      <w:r>
+        <w:t xml:space="preserve">verbesserte Fläche</w:t>
+      </w:r>
+    </w:p>
+    <w:p>
+      <w:pPr>
+        <w:pStyle w:val="Compact"/>
+        <w:numPr>
+          <w:ilvl w:val="0"/>
+          <w:numId w:val="1012"/>
+        </w:numPr>
+      </w:pPr>
+      <w:r>
+        <w:t xml:space="preserve">mindestens eine Klasse besser</w:t>
+      </w:r>
+    </w:p>
+    <w:p>
+      <w:pPr>
+        <w:pStyle w:val="Compact"/>
+        <w:numPr>
+          <w:ilvl w:val="0"/>
+          <w:numId w:val="1012"/>
+        </w:numPr>
+      </w:pPr>
+      <w:r>
+        <w:t xml:space="preserve">mindestens zwei Klassen besser</w:t>
+      </w:r>
+    </w:p>
+    <w:p>
+      <w:pPr>
+        <w:pStyle w:val="Compact"/>
+        <w:numPr>
+          <w:ilvl w:val="0"/>
+          <w:numId w:val="1012"/>
+        </w:numPr>
+      </w:pPr>
+      <w:r>
+        <w:t xml:space="preserve">Klassenwanderungen aus kritischen Klassen</w:t>
+      </w:r>
+    </w:p>
+    <w:bookmarkEnd w:id="104"/>
+    <w:bookmarkEnd w:id="105"/>
+    <w:bookmarkStart w:id="106" w:name="web-version"/>
+    <w:p>
+      <w:pPr>
+        <w:pStyle w:val="Heading1"/>
+      </w:pPr>
+      <w:r>
+        <w:t xml:space="preserve">Web-Version</w:t>
+      </w:r>
+    </w:p>
+    <w:p>
+      <w:pPr>
+        <w:pStyle w:val="FirstParagraph"/>
+      </w:pPr>
+      <w:r>
+        <w:t xml:space="preserve">Die Web-Version deaktiviert die lokale Szenario-Dateiverwaltung. Es werden keine lokalen Dateien geschrieben oder gelesen.</w:t>
+      </w:r>
+    </w:p>
+    <w:p>
+      <w:pPr>
+        <w:pStyle w:val="BodyText"/>
+      </w:pPr>
+      <w:r>
+        <w:t xml:space="preserve">Dauerhaftes Speichern von Szenarien ist in der Web-Version nicht Teil der Modelllogik. Der Vorher/Nachher-Vergleich funktioniert nur innerhalb der laufenden Simulation im Browser. Nach Neuladen der Seite oder nach</w:t>
+      </w:r>
+      <w:r>
+        <w:t xml:space="preserve"> </w:t>
+      </w:r>
+      <w:r>
+        <w:rPr>
+          <w:rStyle w:val="VerbatimChar"/>
+        </w:rPr>
+        <w:t xml:space="preserve">Modellstart /-reset</w:t>
+      </w:r>
+      <w:r>
+        <w:t xml:space="preserve"> </w:t>
+      </w:r>
+      <w:r>
+        <w:t xml:space="preserve">ist der Vergleichszustand verloren.</w:t>
+      </w:r>
+    </w:p>
+    <w:p>
+      <w:pPr>
+        <w:pStyle w:val="BodyText"/>
+      </w:pPr>
+      <w:r>
+        <w:t xml:space="preserve">Die Web-Version nutzt die fest im Modell gespeicherte Referenzgeometrie.</w:t>
+      </w:r>
+    </w:p>
+    <w:bookmarkEnd w:id="106"/>
+    <w:bookmarkStart w:id="107" w:name="didaktische-interpretation"/>
+    <w:p>
+      <w:pPr>
+        <w:pStyle w:val="Heading1"/>
+      </w:pPr>
+      <w:r>
+        <w:t xml:space="preserve">Didaktische Interpretation</w:t>
+      </w:r>
+    </w:p>
+    <w:p>
+      <w:pPr>
+        <w:pStyle w:val="FirstParagraph"/>
+      </w:pPr>
+      <w:r>
+        <w:t xml:space="preserve">Das Modell soll folgende Einsichten sichtbar machen:</w:t>
+      </w:r>
+    </w:p>
+    <w:p>
+      <w:pPr>
+        <w:pStyle w:val="Compact"/>
+        <w:numPr>
+          <w:ilvl w:val="0"/>
+          <w:numId w:val="1013"/>
+        </w:numPr>
+      </w:pPr>
+      <w:r>
+        <w:t xml:space="preserve">Heiße Oberflächen und warme Luft sind nicht dasselbe.</w:t>
+      </w:r>
+    </w:p>
+    <w:p>
+      <w:pPr>
+        <w:pStyle w:val="Compact"/>
+        <w:numPr>
+          <w:ilvl w:val="0"/>
+          <w:numId w:val="1013"/>
+        </w:numPr>
+      </w:pPr>
+      <w:r>
+        <w:t xml:space="preserve">Schatten reduziert die direkte Aufheizung und die Aufenthaltsbelastung.</w:t>
+      </w:r>
+    </w:p>
+    <w:p>
+      <w:pPr>
+        <w:pStyle w:val="Compact"/>
+        <w:numPr>
+          <w:ilvl w:val="0"/>
+          <w:numId w:val="1013"/>
+        </w:numPr>
+      </w:pPr>
+      <w:r>
+        <w:t xml:space="preserve">Vegetation wirkt über Schatten und Verdunstung.</w:t>
+      </w:r>
+    </w:p>
+    <w:p>
+      <w:pPr>
+        <w:pStyle w:val="Compact"/>
+        <w:numPr>
+          <w:ilvl w:val="0"/>
+          <w:numId w:val="1013"/>
+        </w:numPr>
+      </w:pPr>
+      <w:r>
+        <w:t xml:space="preserve">Rasen wirkt anders als Baum, weil Baum zusätzlich 3D-Schatten erzeugt.</w:t>
+      </w:r>
+    </w:p>
+    <w:p>
+      <w:pPr>
+        <w:pStyle w:val="Compact"/>
+        <w:numPr>
+          <w:ilvl w:val="0"/>
+          <w:numId w:val="1013"/>
+        </w:numPr>
+      </w:pPr>
+      <w:r>
+        <w:t xml:space="preserve">Fassadenbegrünung wirkt lokal stark in der Nähe von Gebäuden, vor allem über reduzierte Wandwärmelast und ET-Entlastung.</w:t>
+      </w:r>
+    </w:p>
+    <w:p>
+      <w:pPr>
+        <w:pStyle w:val="Compact"/>
+        <w:numPr>
+          <w:ilvl w:val="0"/>
+          <w:numId w:val="1013"/>
+        </w:numPr>
+      </w:pPr>
+      <w:r>
+        <w:t xml:space="preserve">Gründächer verbessern Dachflächen, sind aber nicht automatisch stärker als bodengebundener Rasen.</w:t>
+      </w:r>
+    </w:p>
+    <w:p>
+      <w:pPr>
+        <w:pStyle w:val="Compact"/>
+        <w:numPr>
+          <w:ilvl w:val="0"/>
+          <w:numId w:val="1013"/>
+        </w:numPr>
+      </w:pPr>
+      <w:r>
+        <w:t xml:space="preserve">Asphalt, Sportbelag und trockene harte Oberflächen erzeugen hohe Oberflächentemperaturen.</w:t>
+      </w:r>
+    </w:p>
+    <w:p>
+      <w:pPr>
+        <w:pStyle w:val="Compact"/>
+        <w:numPr>
+          <w:ilvl w:val="0"/>
+          <w:numId w:val="1013"/>
+        </w:numPr>
+      </w:pPr>
+      <w:r>
+        <w:t xml:space="preserve">Die entscheidende Frage ist nicht nur, wo es kurzzeitig heiß ist, sondern wo sich während der Schulzeit Hitzelast aufsummiert.</w:t>
+      </w:r>
+    </w:p>
+    <w:p>
+      <w:pPr>
+        <w:pStyle w:val="Compact"/>
+        <w:numPr>
+          <w:ilvl w:val="0"/>
+          <w:numId w:val="1013"/>
+        </w:numPr>
+      </w:pPr>
+      <w:r>
+        <w:t xml:space="preserve">Maßnahmen sollen dort gesetzt werden, wo sie die belasteten Aufenthaltsflächen tatsächlich verbessern.</w:t>
+      </w:r>
+    </w:p>
+    <w:bookmarkEnd w:id="107"/>
+    <w:bookmarkStart w:id="108" w:name="modellgrenzen"/>
+    <w:p>
+      <w:pPr>
+        <w:pStyle w:val="Heading1"/>
+      </w:pPr>
+      <w:r>
+        <w:t xml:space="preserve">Modellgrenzen</w:t>
+      </w:r>
+    </w:p>
+    <w:p>
+      <w:pPr>
+        <w:pStyle w:val="FirstParagraph"/>
+      </w:pPr>
+      <w:r>
+        <w:t xml:space="preserve">Das Modell ist bewusst vereinfacht. Es enthält keine vollständige mikrometeorologische Stadtklimaphysik. Insbesondere werden nicht abgebildet:</w:t>
+      </w:r>
+    </w:p>
+    <w:p>
+      <w:pPr>
+        <w:pStyle w:val="Compact"/>
+        <w:numPr>
+          <w:ilvl w:val="0"/>
+          <w:numId w:val="1014"/>
+        </w:numPr>
+      </w:pPr>
+      <w:r>
+        <w:t xml:space="preserve">echte 3D-Strömungsdynamik</w:t>
+      </w:r>
+    </w:p>
+    <w:p>
+      <w:pPr>
+        <w:pStyle w:val="Compact"/>
+        <w:numPr>
+          <w:ilvl w:val="0"/>
+          <w:numId w:val="1014"/>
+        </w:numPr>
+      </w:pPr>
+      <w:r>
+        <w:t xml:space="preserve">turbulente Energiebilanz mit stabilitätsabhängiger Schichtung</w:t>
+      </w:r>
+    </w:p>
+    <w:p>
+      <w:pPr>
+        <w:pStyle w:val="Compact"/>
+        <w:numPr>
+          <w:ilvl w:val="0"/>
+          <w:numId w:val="1014"/>
+        </w:numPr>
+      </w:pPr>
+      <w:r>
+        <w:t xml:space="preserve">echte Gebäudewandorientierungen</w:t>
+      </w:r>
+    </w:p>
+    <w:p>
+      <w:pPr>
+        <w:pStyle w:val="Compact"/>
+        <w:numPr>
+          <w:ilvl w:val="0"/>
+          <w:numId w:val="1014"/>
+        </w:numPr>
+      </w:pPr>
+      <w:r>
+        <w:t xml:space="preserve">reale Bodenfeuchteprofile</w:t>
+      </w:r>
+    </w:p>
+    <w:p>
+      <w:pPr>
+        <w:pStyle w:val="Compact"/>
+        <w:numPr>
+          <w:ilvl w:val="0"/>
+          <w:numId w:val="1014"/>
+        </w:numPr>
+      </w:pPr>
+      <w:r>
+        <w:t xml:space="preserve">echte Pflanzenphysiologie</w:t>
+      </w:r>
+    </w:p>
+    <w:p>
+      <w:pPr>
+        <w:pStyle w:val="Compact"/>
+        <w:numPr>
+          <w:ilvl w:val="0"/>
+          <w:numId w:val="1014"/>
+        </w:numPr>
+      </w:pPr>
+      <w:r>
+        <w:t xml:space="preserve">reale Wurzelräume</w:t>
+      </w:r>
+    </w:p>
+    <w:p>
+      <w:pPr>
+        <w:pStyle w:val="Compact"/>
+        <w:numPr>
+          <w:ilvl w:val="0"/>
+          <w:numId w:val="1014"/>
+        </w:numPr>
+      </w:pPr>
+      <w:r>
+        <w:t xml:space="preserve">Wolken, wechselnde Wetterlagen oder Niederschlagsereignisse</w:t>
+      </w:r>
+    </w:p>
+    <w:p>
+      <w:pPr>
+        <w:pStyle w:val="Compact"/>
+        <w:numPr>
+          <w:ilvl w:val="0"/>
+          <w:numId w:val="1014"/>
+        </w:numPr>
+      </w:pPr>
+      <w:r>
+        <w:t xml:space="preserve">Kalibrierung gegen Messdaten</w:t>
+      </w:r>
+    </w:p>
+    <w:p>
+      <w:pPr>
+        <w:pStyle w:val="Compact"/>
+        <w:numPr>
+          <w:ilvl w:val="0"/>
+          <w:numId w:val="1014"/>
+        </w:numPr>
+      </w:pPr>
+      <w:r>
         <w:t xml:space="preserve">vollständige humanbiometeorologische Indizes wie UTCI oder PET</w:t>
       </w:r>
     </w:p>
@@ -26591,8 +29209,8 @@
         <w:t xml:space="preserve">Die Hitzelast ist deshalb kein medizinischer Grenzwert. Sie ist ein didaktischer Belastungsproxy.</w:t>
       </w:r>
     </w:p>
-    <w:bookmarkEnd w:id="97"/>
-    <w:bookmarkStart w:id="98" w:name="zentrale-prozeduren"/>
+    <w:bookmarkEnd w:id="108"/>
+    <w:bookmarkStart w:id="109" w:name="zentrale-prozeduren"/>
     <w:p>
       <w:pPr>
         <w:pStyle w:val="Heading1"/>
@@ -27045,8 +29663,8 @@
         </w:tc>
       </w:tr>
     </w:tbl>
-    <w:bookmarkEnd w:id="98"/>
-    <w:bookmarkStart w:id="99" w:name="Xac1efd26fd88baea019c3940766f0fcd5482841"/>
+    <w:bookmarkEnd w:id="109"/>
+    <w:bookmarkStart w:id="110" w:name="Xac1efd26fd88baea019c3940766f0fcd5482841"/>
     <w:p>
       <w:pPr>
         <w:pStyle w:val="Heading1"/>
@@ -27068,7 +29686,7 @@
         <w:pStyle w:val="Compact"/>
         <w:numPr>
           <w:ilvl w:val="0"/>
-          <w:numId w:val="1012"/>
+          <w:numId w:val="1015"/>
         </w:numPr>
       </w:pPr>
       <w:r>
@@ -27080,7 +29698,7 @@
         <w:pStyle w:val="Compact"/>
         <w:numPr>
           <w:ilvl w:val="0"/>
-          <w:numId w:val="1012"/>
+          <w:numId w:val="1015"/>
         </w:numPr>
       </w:pPr>
       <w:r>
@@ -27092,7 +29710,7 @@
         <w:pStyle w:val="Compact"/>
         <w:numPr>
           <w:ilvl w:val="0"/>
-          <w:numId w:val="1012"/>
+          <w:numId w:val="1015"/>
         </w:numPr>
       </w:pPr>
       <w:r>
@@ -27104,7 +29722,7 @@
         <w:pStyle w:val="Compact"/>
         <w:numPr>
           <w:ilvl w:val="0"/>
-          <w:numId w:val="1012"/>
+          <w:numId w:val="1015"/>
         </w:numPr>
       </w:pPr>
       <w:r>
@@ -27116,7 +29734,7 @@
         <w:pStyle w:val="Compact"/>
         <w:numPr>
           <w:ilvl w:val="0"/>
-          <w:numId w:val="1012"/>
+          <w:numId w:val="1015"/>
         </w:numPr>
       </w:pPr>
       <w:r>
@@ -27128,7 +29746,7 @@
         <w:pStyle w:val="Compact"/>
         <w:numPr>
           <w:ilvl w:val="0"/>
-          <w:numId w:val="1012"/>
+          <w:numId w:val="1015"/>
         </w:numPr>
       </w:pPr>
       <w:r>
@@ -27140,7 +29758,7 @@
         <w:pStyle w:val="Compact"/>
         <w:numPr>
           <w:ilvl w:val="0"/>
-          <w:numId w:val="1012"/>
+          <w:numId w:val="1015"/>
         </w:numPr>
       </w:pPr>
       <w:r>
@@ -27152,7 +29770,7 @@
         <w:pStyle w:val="Compact"/>
         <w:numPr>
           <w:ilvl w:val="0"/>
-          <w:numId w:val="1012"/>
+          <w:numId w:val="1015"/>
         </w:numPr>
       </w:pPr>
       <w:r>
@@ -27164,7 +29782,7 @@
         <w:pStyle w:val="Compact"/>
         <w:numPr>
           <w:ilvl w:val="0"/>
-          <w:numId w:val="1012"/>
+          <w:numId w:val="1015"/>
         </w:numPr>
       </w:pPr>
       <w:r>
@@ -27179,7 +29797,7 @@
         <w:t xml:space="preserve">Damit bildet das Modell keine exakte Realität nach, sondern eine transparente Wirklogik für schulische Klima- und Anpassungsfragen.</w:t>
       </w:r>
     </w:p>
-    <w:bookmarkEnd w:id="99"/>
+    <w:bookmarkEnd w:id="110"/>
     <w:sectPr>
       <w:footnotePr>
         <w:numRestart w:val="eachSect"/>
@@ -27485,6 +30103,15 @@
     <w:abstractNumId w:val="991"/>
   </w:num>
   <w:num w:numId="1002">
+    <w:abstractNumId w:val="991"/>
+  </w:num>
+  <w:num w:numId="1003">
+    <w:abstractNumId w:val="991"/>
+  </w:num>
+  <w:num w:numId="1004">
+    <w:abstractNumId w:val="991"/>
+  </w:num>
+  <w:num w:numId="1005">
     <w:abstractNumId w:val="99411"/>
     <w:lvlOverride w:ilvl="0">
       <w:startOverride w:val="1"/>
@@ -27514,15 +30141,6 @@
       <w:startOverride w:val="1"/>
     </w:lvlOverride>
   </w:num>
-  <w:num w:numId="1003">
-    <w:abstractNumId w:val="991"/>
-  </w:num>
-  <w:num w:numId="1004">
-    <w:abstractNumId w:val="991"/>
-  </w:num>
-  <w:num w:numId="1005">
-    <w:abstractNumId w:val="991"/>
-  </w:num>
   <w:num w:numId="1006">
     <w:abstractNumId w:val="991"/>
   </w:num>
@@ -27542,6 +30160,15 @@
     <w:abstractNumId w:val="991"/>
   </w:num>
   <w:num w:numId="1012">
+    <w:abstractNumId w:val="991"/>
+  </w:num>
+  <w:num w:numId="1013">
+    <w:abstractNumId w:val="991"/>
+  </w:num>
+  <w:num w:numId="1014">
+    <w:abstractNumId w:val="991"/>
+  </w:num>
+  <w:num w:numId="1015">
     <w:abstractNumId w:val="99411"/>
     <w:lvlOverride w:ilvl="0">
       <w:startOverride w:val="1"/>

</xml_diff>